<commit_message>
Rewrite report in plain first-person style and trim references
The brief only asks for APA references 'if any'; keep just the AI-use
reference and the two papers the 2.2B method is taken from. All results,
figures and tables are unchanged.

Co-Authored-By: Claude Opus 5.5 <noreply@anthropic.com>
Claude-Session: https://claude.ai/code/session_01Ac9AgqpHg8bUEYkUDimNny
</commit_message>
<xml_diff>
--- a/Assignment2/COSC2670-s4119075-A2report.docx
+++ b/Assignment2/COSC2670-s4119075-A2report.docx
@@ -81,22 +81,12 @@
       <w:r>
         <w:rPr>
           <w:rFonts w:ascii="Arial" w:hAnsi="Arial" w:eastAsia="Arial"/>
-          <w:b/>
+          <w:b w:val="0"/>
           <w:i w:val="0"/>
           <w:color w:val="1A1A1A"/>
           <w:sz w:val="20"/>
         </w:rPr>
-        <w:t>Data preparation and sampling.</w:t>
-      </w:r>
-      <w:r>
-        <w:rPr>
-          <w:rFonts w:ascii="Arial" w:hAnsi="Arial" w:eastAsia="Arial"/>
-          <w:b w:val="0"/>
-          <w:i w:val="0"/>
-          <w:color w:val="1A1A1A"/>
-          <w:sz w:val="20"/>
-        </w:rPr>
-        <w:t xml:space="preserve"> The full dataset (13,611 beans, 16 numeric inputs, 7 classes) contains no missing or non-positive values but has 68 exact duplicate rows, which were removed so that the same bean cannot appear twice in a sample (e.g. in both a training and a test set). From the remaining 13,543 complete, unique rows, three simple random samples without replacement were drawn with a fixed seed (300, 2,000 and 2,000 rows) and saved as COSC2670-s4119075-A2SampleOne/Two/Three.csv. Each task reloads its saved file, so every result in a task is based on the same sample. All analysis uses Python (pandas, scikit-learn; Pedregosa et al., 2011).</w:t>
+        <w:t>Before starting the tasks I checked the data. All 13,611 rows are complete (no missing values) and every measurement is positive, but 68 rows are exact duplicates. I removed those so the same bean could not end up in both a training and a test set, which left 13,543 rows. From these I drew the three random samples (300, 2,000 and 2,000 rows) with a fixed seed and saved them as COSC2670-s4119075-A2SampleOne/Two/Three.csv. Each task loads its own saved file, so all results within a task come from the same sample.</w:t>
       </w:r>
     </w:p>
     <w:p>
@@ -141,17 +131,13 @@
           <w:color w:val="1A1A1A"/>
           <w:sz w:val="20"/>
         </w:rPr>
-        <w:t>Figure 1 shows a very strong, positive and almost linear relationship: longer beans have longer outlines (Pearson r = 0.977, Spearman ρ = 0.970). Several patterns and unusual observations stand out:</w:t>
+        <w:t>Figure 1 shows that the two variables have a very strong, positive and almost straight-line relationship (Pearson r = 0.977). This makes sense, because a longer bean has a longer outline. I coloured the points by bean class only to help explain what I saw. Three things stood out to me.</w:t>
       </w:r>
     </w:p>
     <w:p>
       <w:pPr>
         <w:keepNext w:val="0"/>
-        <w:tabs>
-          <w:tab w:pos="255" w:val="left"/>
-        </w:tabs>
-        <w:spacing w:after="40" w:before="0" w:line="240" w:lineRule="auto"/>
-        <w:ind w:left="255" w:hanging="170"/>
+        <w:spacing w:after="80" w:before="0" w:line="240" w:lineRule="auto"/>
         <w:jc w:val="both"/>
       </w:pPr>
       <w:r>
@@ -162,19 +148,32 @@
           <w:color w:val="1A1A1A"/>
           <w:sz w:val="20"/>
         </w:rPr>
-        <w:t>•</w:t>
-        <w:tab/>
-      </w:r>
-      <w:r>
-        <w:rPr>
-          <w:rFonts w:ascii="Arial" w:hAnsi="Arial" w:eastAsia="Arial"/>
-          <w:b/>
+        <w:t>First, the 13 Bombay beans sit on their own in the top-right corner (lengths of 526–680 px). They are the only outliers on both variables, but they are real, large beans that follow the same trend, so I kept them. Between about 450 and 525 px there are no beans at all, so the data are not spread evenly, and this small group has a lot of pull on the fitted line.</w:t>
+      </w:r>
+    </w:p>
+    <w:p>
+      <w:pPr>
+        <w:keepNext w:val="0"/>
+        <w:spacing w:after="80" w:before="0" w:line="240" w:lineRule="auto"/>
+        <w:jc w:val="both"/>
+      </w:pPr>
+      <w:r>
+        <w:rPr>
+          <w:rFonts w:ascii="Arial" w:hAnsi="Arial" w:eastAsia="Arial"/>
+          <w:b w:val="0"/>
           <w:i w:val="0"/>
           <w:color w:val="1A1A1A"/>
           <w:sz w:val="20"/>
         </w:rPr>
-        <w:t>Distinct Bombay group.</w:t>
-      </w:r>
+        <w:t>Second, the classes form slightly different bands. At the same length, rounder beans (Seker, Barbunya) have a longer perimeter than elongated ones (Horoz, Cali). So perimeter depends on shape as well as on length.</w:t>
+      </w:r>
+    </w:p>
+    <w:p>
+      <w:pPr>
+        <w:keepNext w:val="0"/>
+        <w:spacing w:after="80" w:before="0" w:line="240" w:lineRule="auto"/>
+        <w:jc w:val="both"/>
+      </w:pPr>
       <w:r>
         <w:rPr>
           <w:rFonts w:ascii="Arial" w:hAnsi="Arial" w:eastAsia="Arial"/>
@@ -183,91 +182,7 @@
           <w:color w:val="1A1A1A"/>
           <w:sz w:val="20"/>
         </w:rPr>
-        <w:t xml:space="preserve"> The 13 Bombay beans form a separate cluster in the top-right corner (MajorAxisLength 526–680 px, Perimeter 1,430–1,777 px). They are the only IQR outliers on both variables, but they are genuine large beans that follow the same trend, so they were kept. There is a gap with no beans between about 450 and 525 px, so the data are not spread evenly over the range, and this small group strongly influences (has high leverage on) the fitted line.</w:t>
-      </w:r>
-    </w:p>
-    <w:p>
-      <w:pPr>
-        <w:keepNext w:val="0"/>
-        <w:tabs>
-          <w:tab w:pos="255" w:val="left"/>
-        </w:tabs>
-        <w:spacing w:after="40" w:before="0" w:line="240" w:lineRule="auto"/>
-        <w:ind w:left="255" w:hanging="170"/>
-        <w:jc w:val="both"/>
-      </w:pPr>
-      <w:r>
-        <w:rPr>
-          <w:rFonts w:ascii="Arial" w:hAnsi="Arial" w:eastAsia="Arial"/>
-          <w:b w:val="0"/>
-          <w:i w:val="0"/>
-          <w:color w:val="1A1A1A"/>
-          <w:sz w:val="20"/>
-        </w:rPr>
-        <w:t>•</w:t>
-        <w:tab/>
-      </w:r>
-      <w:r>
-        <w:rPr>
-          <w:rFonts w:ascii="Arial" w:hAnsi="Arial" w:eastAsia="Arial"/>
-          <w:b/>
-          <w:i w:val="0"/>
-          <w:color w:val="1A1A1A"/>
-          <w:sz w:val="20"/>
-        </w:rPr>
-        <w:t>Class-specific bands.</w:t>
-      </w:r>
-      <w:r>
-        <w:rPr>
-          <w:rFonts w:ascii="Arial" w:hAnsi="Arial" w:eastAsia="Arial"/>
-          <w:b w:val="0"/>
-          <w:i w:val="0"/>
-          <w:color w:val="1A1A1A"/>
-          <w:sz w:val="20"/>
-        </w:rPr>
-        <w:t xml:space="preserve"> At the same length, round classes have longer perimeters than elongated ones. Seker and Barbunya lie above the main trend, and Horoz and Cali lie below it. The relationship therefore also depends on bean shape (width), not only on length.</w:t>
-      </w:r>
-    </w:p>
-    <w:p>
-      <w:pPr>
-        <w:keepNext w:val="0"/>
-        <w:tabs>
-          <w:tab w:pos="255" w:val="left"/>
-        </w:tabs>
-        <w:spacing w:after="40" w:before="0" w:line="240" w:lineRule="auto"/>
-        <w:ind w:left="255" w:hanging="170"/>
-        <w:jc w:val="both"/>
-      </w:pPr>
-      <w:r>
-        <w:rPr>
-          <w:rFonts w:ascii="Arial" w:hAnsi="Arial" w:eastAsia="Arial"/>
-          <w:b w:val="0"/>
-          <w:i w:val="0"/>
-          <w:color w:val="1A1A1A"/>
-          <w:sz w:val="20"/>
-        </w:rPr>
-        <w:t>•</w:t>
-        <w:tab/>
-      </w:r>
-      <w:r>
-        <w:rPr>
-          <w:rFonts w:ascii="Arial" w:hAnsi="Arial" w:eastAsia="Arial"/>
-          <w:b/>
-          <w:i w:val="0"/>
-          <w:color w:val="1A1A1A"/>
-          <w:sz w:val="20"/>
-        </w:rPr>
-        <w:t>Increasing spread.</w:t>
-      </w:r>
-      <w:r>
-        <w:rPr>
-          <w:rFonts w:ascii="Arial" w:hAnsi="Arial" w:eastAsia="Arial"/>
-          <w:b w:val="0"/>
-          <w:i w:val="0"/>
-          <w:color w:val="1A1A1A"/>
-          <w:sz w:val="20"/>
-        </w:rPr>
-        <w:t xml:space="preserve"> The vertical scatter grows with size and is largest for Barbunya (e.g. one bean of about 405 px has a perimeter of 1,340 px), which suggests irregular outlines and mild heteroscedasticity, meaning the variance is not constant.</w:t>
+        <w:t>Third, the spread gets wider as beans get bigger, and it is widest for Barbunya. One Barbunya bean of about 405 px has a perimeter of 1,340 px, well above the others, which points to an irregular outline.</w:t>
       </w:r>
     </w:p>
     <w:p>
@@ -334,7 +249,7 @@
           <w:color w:val="404040"/>
           <w:sz w:val="17"/>
         </w:rPr>
-        <w:t>Perimeter versus MajorAxisLength for the 300 sampled beans; colour and marker show the bean class, which is used only to explain the patterns.</w:t>
+        <w:t>Perimeter against MajorAxisLength for the 300 sampled beans, coloured by class.</w:t>
       </w:r>
     </w:p>
     <w:p>
@@ -365,7 +280,7 @@
           <w:color w:val="1A1A1A"/>
           <w:sz w:val="20"/>
         </w:rPr>
-        <w:t>The sample was split at random into 240 training and 60 test beans. An ordinary least-squares model with Perimeter as the dependent variable and MajorAxisLength as the independent variable was fitted on the training data:</w:t>
+        <w:t>I split the sample randomly into 240 training and 60 test beans and fitted an ordinary least-squares line on the training beans, with Perimeter as the dependent variable:</w:t>
       </w:r>
     </w:p>
     <w:p>
@@ -384,16 +299,6 @@
         </w:rPr>
         <w:t>Perimeter = 53.90 + 2.520 × MajorAxisLength</w:t>
       </w:r>
-      <w:r>
-        <w:rPr>
-          <w:rFonts w:ascii="Arial" w:hAnsi="Arial" w:eastAsia="Arial"/>
-          <w:b w:val="0"/>
-          <w:i w:val="0"/>
-          <w:color w:val="1A1A1A"/>
-          <w:sz w:val="20"/>
-        </w:rPr>
-        <w:t xml:space="preserve">   (95% CI: slope [2.447, 2.593], intercept [29.5, 78.3])</w:t>
-      </w:r>
     </w:p>
     <w:p>
       <w:pPr>
@@ -404,22 +309,12 @@
       <w:r>
         <w:rPr>
           <w:rFonts w:ascii="Arial" w:hAnsi="Arial" w:eastAsia="Arial"/>
-          <w:b/>
+          <w:b w:val="0"/>
           <w:i w:val="0"/>
           <w:color w:val="1A1A1A"/>
           <w:sz w:val="20"/>
         </w:rPr>
-        <w:t>Interpretation of the coefficients.</w:t>
-      </w:r>
-      <w:r>
-        <w:rPr>
-          <w:rFonts w:ascii="Arial" w:hAnsi="Arial" w:eastAsia="Arial"/>
-          <w:b w:val="0"/>
-          <w:i w:val="0"/>
-          <w:color w:val="1A1A1A"/>
-          <w:sz w:val="20"/>
-        </w:rPr>
-        <w:t xml:space="preserve"> The slope means that every extra pixel of major-axis length increases the expected perimeter by about 2.52 pixels, or about 25 px per 10 px of length. This is geometrically plausible. An ellipse with major axis L has a perimeter between 2L (a very flat shape) and πL ≈ 3.14L (a circle), and beans are ellipse-like with an average aspect ratio of about 1.6, so a factor near 2.5 is expected. The intercept is the predicted perimeter for a bean of zero length. That lies far outside the observed range (201–680 px), so it has no physical meaning and only positions the line. It is positive because perimeter also depends on the minor axis (width), which this model does not include.</w:t>
+        <w:t>The slope means that each extra pixel of length adds about 2.52 pixels of perimeter on average (95% confidence interval 2.45 to 2.59). This value seemed reasonable to me: a very flat ellipse has a perimeter close to 2 × its length, and a circle has π × its diameter ≈ 3.14 ×, so a bean-shaped object should land somewhere between the two. The intercept (53.9) would be the perimeter of a bean with zero length. That is far outside the data (the shortest bean is 201 px), so it has no real meaning and just positions the line. It is probably positive because perimeter also depends on width, which this model leaves out.</w:t>
       </w:r>
     </w:p>
     <w:p>
@@ -446,7 +341,7 @@
           <w:color w:val="404040"/>
           <w:sz w:val="17"/>
         </w:rPr>
-        <w:t>Regression performance (Perimeter in pixels).</w:t>
+        <w:t>Regression performance (errors in pixels).</w:t>
       </w:r>
     </w:p>
     <w:tbl>
@@ -1055,42 +950,12 @@
       <w:r>
         <w:rPr>
           <w:rFonts w:ascii="Arial" w:hAnsi="Arial" w:eastAsia="Arial"/>
-          <w:b/>
+          <w:b w:val="0"/>
           <w:i w:val="0"/>
           <w:color w:val="1A1A1A"/>
           <w:sz w:val="20"/>
         </w:rPr>
-        <w:t>How well does the model represent the relationship?</w:t>
-      </w:r>
-      <w:r>
-        <w:rPr>
-          <w:rFonts w:ascii="Arial" w:hAnsi="Arial" w:eastAsia="Arial"/>
-          <w:b w:val="0"/>
-          <w:i w:val="0"/>
-          <w:color w:val="1A1A1A"/>
-          <w:sz w:val="20"/>
-        </w:rPr>
-        <w:t xml:space="preserve"> Using R² (the share of variance explained), RMSE and MAE (typical errors in pixels) and MAPE (relative error), the line explains about 95–97% of the variation in perimeter, with a typical error of 27–35 px (3.4–4.0%). The test R² is slightly higher than the training R² only because the small random test set happens to contain few of the irregular Barbunya beans. 10-fold cross-validation confirms a stable R² of 0.953. The residual plot (Figure 2b) shows the model's limitation: the residuals are </w:t>
-      </w:r>
-      <w:r>
-        <w:rPr>
-          <w:rFonts w:ascii="Arial" w:hAnsi="Arial" w:eastAsia="Arial"/>
-          <w:b/>
-          <w:i w:val="0"/>
-          <w:color w:val="1A1A1A"/>
-          <w:sz w:val="20"/>
-        </w:rPr>
-        <w:t>not random but depend on the class</w:t>
-      </w:r>
-      <w:r>
-        <w:rPr>
-          <w:rFonts w:ascii="Arial" w:hAnsi="Arial" w:eastAsia="Arial"/>
-          <w:b w:val="0"/>
-          <w:i w:val="0"/>
-          <w:color w:val="1A1A1A"/>
-          <w:sz w:val="20"/>
-        </w:rPr>
-        <w:t>. Elongated Horoz (mean residual −61 px) and Cali (−26 px) are over-predicted, while round Seker (+45 px), Barbunya (+59 px) and Bombay (+37 px) are under-predicted. The residuals correlate strongly with AspectRation (r = −0.72), so most of the remaining error comes from bean shape, which a single length variable cannot capture. Overall, the linear model is an accurate first-order description of how perimeter grows with size. Adding a width or shape variable (multiple regression), or letting the slope differ by class, would remove the systematic error.</w:t>
+        <w:t>Overall the line represents the relationship well. It explains about 95–97% of the variation in perimeter, and the typical error is around 30–35 px, or 3–4% of a bean's perimeter (Table 1). The test score is a little higher than the training score, but that is just luck of the split: only 3 of the 60 test beans are Barbunya, the class with the largest errors. Cross-validation gives a steady R² of 0.953. The residual plot (Figure 2b) shows the main weakness. The errors are not random but depend on the class. Horoz beans are over-predicted by about 61 px on average, while Seker, Barbunya and Bombay are under-predicted by 37–59 px. The residuals are strongly related to aspect ratio (r = −0.72), so the missing piece is shape. Adding a width or shape variable would fix most of this.</w:t>
       </w:r>
     </w:p>
     <w:p>
@@ -1157,7 +1022,7 @@
           <w:color w:val="404040"/>
           <w:sz w:val="17"/>
         </w:rPr>
-        <w:t>(a) Training and test points with the fitted regression line; (b) residuals versus fitted values coloured by class, showing systematic, shape-related errors.</w:t>
+        <w:t>(a) Training and test beans with the fitted line; (b) residuals against fitted values, coloured by class.</w:t>
       </w:r>
     </w:p>
     <w:p>
@@ -1188,67 +1053,7 @@
           <w:color w:val="1A1A1A"/>
           <w:sz w:val="20"/>
         </w:rPr>
-        <w:t xml:space="preserve">Sample Two (2,000 beans: Dermason 546, Sira 400, Horoz 286, Seker 273, Cali 225, Barbunya 190, Bombay 80) was split once into a </w:t>
-      </w:r>
-      <w:r>
-        <w:rPr>
-          <w:rFonts w:ascii="Arial" w:hAnsi="Arial" w:eastAsia="Arial"/>
-          <w:b/>
-          <w:i w:val="0"/>
-          <w:color w:val="1A1A1A"/>
-          <w:sz w:val="20"/>
-        </w:rPr>
-        <w:t>stratified 80/20 training/test split</w:t>
-      </w:r>
-      <w:r>
-        <w:rPr>
-          <w:rFonts w:ascii="Arial" w:hAnsi="Arial" w:eastAsia="Arial"/>
-          <w:b w:val="0"/>
-          <w:i w:val="0"/>
-          <w:color w:val="1A1A1A"/>
-          <w:sz w:val="20"/>
-        </w:rPr>
-        <w:t xml:space="preserve"> (1,600/400). Stratification keeps the class proportions, including the small Bombay class, the same in both sets, and the same split is reused for every classifier. All model development (preprocessing parameters and hyperparameters) used only the training data, with </w:t>
-      </w:r>
-      <w:r>
-        <w:rPr>
-          <w:rFonts w:ascii="Arial" w:hAnsi="Arial" w:eastAsia="Arial"/>
-          <w:b/>
-          <w:i w:val="0"/>
-          <w:color w:val="1A1A1A"/>
-          <w:sz w:val="20"/>
-        </w:rPr>
-        <w:t>10-fold stratified cross-validation repeated 3 times (30 folds)</w:t>
-      </w:r>
-      <w:r>
-        <w:rPr>
-          <w:rFonts w:ascii="Arial" w:hAnsi="Arial" w:eastAsia="Arial"/>
-          <w:b w:val="0"/>
-          <w:i w:val="0"/>
-          <w:color w:val="1A1A1A"/>
-          <w:sz w:val="20"/>
-        </w:rPr>
-        <w:t xml:space="preserve">. Preprocessing was placed inside a scikit-learn Pipeline so that it is re-fitted on the training folds only, which prevents data leakage. Because the classes are imbalanced, the selection criterion is </w:t>
-      </w:r>
-      <w:r>
-        <w:rPr>
-          <w:rFonts w:ascii="Arial" w:hAnsi="Arial" w:eastAsia="Arial"/>
-          <w:b/>
-          <w:i w:val="0"/>
-          <w:color w:val="1A1A1A"/>
-          <w:sz w:val="20"/>
-        </w:rPr>
-        <w:t>macro-F1</w:t>
-      </w:r>
-      <w:r>
-        <w:rPr>
-          <w:rFonts w:ascii="Arial" w:hAnsi="Arial" w:eastAsia="Arial"/>
-          <w:b w:val="0"/>
-          <w:i w:val="0"/>
-          <w:color w:val="1A1A1A"/>
-          <w:sz w:val="20"/>
-        </w:rPr>
-        <w:t>, which weights every class equally. The test set was used once per model for the final evaluation with the same metrics: accuracy, macro precision, macro recall, macro F1 and the confusion matrix.</w:t>
+        <w:t>Sample Two has 2,000 beans, and the classes are uneven: from 546 Dermason down to only 80 Bombay. I made one stratified 80/20 split (1,600 training and 400 test beans), so both sets keep the same class proportions, and used this same split for every model. All tuning was done on the training set with 10-fold stratified cross-validation repeated 3 times. Scaling was placed inside a pipeline so it was only ever fitted on training folds. Because of the class imbalance I used macro F1 (every class counts equally) to choose settings. For the final test I report accuracy, macro precision, macro recall and macro F1.</w:t>
       </w:r>
     </w:p>
     <w:p>
@@ -1274,22 +1079,12 @@
       <w:r>
         <w:rPr>
           <w:rFonts w:ascii="Arial" w:hAnsi="Arial" w:eastAsia="Arial"/>
-          <w:b/>
+          <w:b w:val="0"/>
           <w:i w:val="0"/>
           <w:color w:val="1A1A1A"/>
           <w:sz w:val="20"/>
         </w:rPr>
-        <w:t>Preprocessing.</w:t>
-      </w:r>
-      <w:r>
-        <w:rPr>
-          <w:rFonts w:ascii="Arial" w:hAnsi="Arial" w:eastAsia="Arial"/>
-          <w:b w:val="0"/>
-          <w:i w:val="0"/>
-          <w:color w:val="1A1A1A"/>
-          <w:sz w:val="20"/>
-        </w:rPr>
-        <w:t xml:space="preserve"> kNN classifies a bean by the classes of the beans closest to it in Euclidean distance, so features with large numeric ranges dominate. Here the scales differ by about seven orders of magnitude (Area ≈ 53,000 px versus ShapeFactor2 ≈ 0.0017). All 16 inputs were therefore z-standardised to mean 0 and SD 1. The evidence is clear: without scaling, the best CV macro-F1 is only 0.631, against 0.931 with scaling. There were no missing values or categorical inputs to handle.</w:t>
+        <w:t>kNN decides by distance, so the feature scales matter a lot. Area is in the tens of thousands while ShapeFactor2 is around 0.002, so without scaling Area would decide almost everything. I therefore standardised all 16 features. The difference was large: the best cross-validated macro F1 was only 0.631 without scaling, compared with 0.931 with it.</w:t>
       </w:r>
     </w:p>
     <w:p>
@@ -1301,12 +1096,22 @@
       <w:r>
         <w:rPr>
           <w:rFonts w:ascii="Arial" w:hAnsi="Arial" w:eastAsia="Arial"/>
+          <w:b w:val="0"/>
+          <w:i w:val="0"/>
+          <w:color w:val="1A1A1A"/>
+          <w:sz w:val="20"/>
+        </w:rPr>
+        <w:t xml:space="preserve">To choose k, I tried every value from 1 to 40 (Figure 3a). Very small k did poorly, because the model reacts to single noisy beans (k = 1 gave 0.907 and k = 2 gave 0.894). From about k = 8 to 20 the score is flat, and after that it slowly drops as the neighbourhoods get too big and smaller classes get out-voted. I chose </w:t>
+      </w:r>
+      <w:r>
+        <w:rPr>
+          <w:rFonts w:ascii="Arial" w:hAnsi="Arial" w:eastAsia="Arial"/>
           <w:b/>
           <w:i w:val="0"/>
           <w:color w:val="1A1A1A"/>
           <w:sz w:val="20"/>
         </w:rPr>
-        <w:t>Choice of k.</w:t>
+        <w:t>k = 14</w:t>
       </w:r>
       <w:r>
         <w:rPr>
@@ -1316,27 +1121,7 @@
           <w:color w:val="1A1A1A"/>
           <w:sz w:val="20"/>
         </w:rPr>
-        <w:t xml:space="preserve"> k = 1–40 was evaluated (Figure 3a). Very small k overfits to individual noisy beans (k = 1: macro-F1 0.907; k = 2: 0.894, caused by frequent ties). Performance then reaches a broad plateau between k ≈ 8 and 20 (all within 0.005 of the best), and declines slowly for larger k (0.922 at k = 40), as neighbourhoods become so large that boundary beans are absorbed by bigger neighbouring classes. </w:t>
-      </w:r>
-      <w:r>
-        <w:rPr>
-          <w:rFonts w:ascii="Arial" w:hAnsi="Arial" w:eastAsia="Arial"/>
-          <w:b/>
-          <w:i w:val="0"/>
-          <w:color w:val="1A1A1A"/>
-          <w:sz w:val="20"/>
-        </w:rPr>
-        <w:t>k = 14</w:t>
-      </w:r>
-      <w:r>
-        <w:rPr>
-          <w:rFonts w:ascii="Arial" w:hAnsi="Arial" w:eastAsia="Arial"/>
-          <w:b w:val="0"/>
-          <w:i w:val="0"/>
-          <w:color w:val="1A1A1A"/>
-          <w:sz w:val="20"/>
-        </w:rPr>
-        <w:t xml:space="preserve"> gave the highest CV macro-F1 (0.931 ± 0.017; accuracy 0.919). It lies in the middle of the plateau, so the choice is robust and is not a single lucky peak.</w:t>
+        <w:t xml:space="preserve"> because it had the best score (macro F1 0.931) and sits in the middle of the flat region, so a slightly different k would give almost the same result.</w:t>
       </w:r>
     </w:p>
     <w:p>
@@ -1348,62 +1133,12 @@
       <w:r>
         <w:rPr>
           <w:rFonts w:ascii="Arial" w:hAnsi="Arial" w:eastAsia="Arial"/>
-          <w:b/>
+          <w:b w:val="0"/>
           <w:i w:val="0"/>
           <w:color w:val="1A1A1A"/>
           <w:sz w:val="20"/>
         </w:rPr>
-        <w:t>Test performance.</w:t>
-      </w:r>
-      <w:r>
-        <w:rPr>
-          <w:rFonts w:ascii="Arial" w:hAnsi="Arial" w:eastAsia="Arial"/>
-          <w:b w:val="0"/>
-          <w:i w:val="0"/>
-          <w:color w:val="1A1A1A"/>
-          <w:sz w:val="20"/>
-        </w:rPr>
-        <w:t xml:space="preserve"> Accuracy = 0.923, macro precision = 0.931, macro recall = 0.927 and macro F1 = 0.929. Bombay is recognised perfectly (it is far larger than every other variety). Most of the 31 errors involve two pairs of morphologically similar varieties: </w:t>
-      </w:r>
-      <w:r>
-        <w:rPr>
-          <w:rFonts w:ascii="Arial" w:hAnsi="Arial" w:eastAsia="Arial"/>
-          <w:b/>
-          <w:i w:val="0"/>
-          <w:color w:val="1A1A1A"/>
-          <w:sz w:val="20"/>
-        </w:rPr>
-        <w:t>Dermason↔Sira</w:t>
-      </w:r>
-      <w:r>
-        <w:rPr>
-          <w:rFonts w:ascii="Arial" w:hAnsi="Arial" w:eastAsia="Arial"/>
-          <w:b w:val="0"/>
-          <w:i w:val="0"/>
-          <w:color w:val="1A1A1A"/>
-          <w:sz w:val="20"/>
-        </w:rPr>
-        <w:t xml:space="preserve"> (13 errors) and </w:t>
-      </w:r>
-      <w:r>
-        <w:rPr>
-          <w:rFonts w:ascii="Arial" w:hAnsi="Arial" w:eastAsia="Arial"/>
-          <w:b/>
-          <w:i w:val="0"/>
-          <w:color w:val="1A1A1A"/>
-          <w:sz w:val="20"/>
-        </w:rPr>
-        <w:t>Barbunya↔Cali</w:t>
-      </w:r>
-      <w:r>
-        <w:rPr>
-          <w:rFonts w:ascii="Arial" w:hAnsi="Arial" w:eastAsia="Arial"/>
-          <w:b w:val="0"/>
-          <w:i w:val="0"/>
-          <w:color w:val="1A1A1A"/>
-          <w:sz w:val="20"/>
-        </w:rPr>
-        <w:t xml:space="preserve"> (7 errors), as shown in Figure 3b. This matches the original study of the dataset, in which Sira was also the hardest class (Koklu &amp; Ozkan, 2020).</w:t>
+        <w:t>On the test set the tuned kNN reached an accuracy of 0.923, macro precision 0.931, macro recall 0.927 and macro F1 0.929. Bombay was classified perfectly, since it is so much bigger than the other beans. Most of the 31 mistakes were between Dermason and Sira (13) and between Barbunya and Cali (7), as Figure 3b shows. These pairs simply look alike.</w:t>
       </w:r>
     </w:p>
     <w:p>
@@ -1470,7 +1205,7 @@
           <w:color w:val="404040"/>
           <w:sz w:val="17"/>
         </w:rPr>
-        <w:t>(a) Repeated 10-fold CV macro-F1 (±1 SD band) and accuracy for k = 1–40 on the training set; (b) confusion matrix of the selected kNN (k = 14) on the 400 test beans.</w:t>
+        <w:t>(a) Cross-validated macro F1 and accuracy for k = 1–40; (b) test confusion matrix for k = 14.</w:t>
       </w:r>
     </w:p>
     <w:p>
@@ -1496,22 +1231,12 @@
       <w:r>
         <w:rPr>
           <w:rFonts w:ascii="Arial" w:hAnsi="Arial" w:eastAsia="Arial"/>
-          <w:b/>
+          <w:b w:val="0"/>
           <w:i w:val="0"/>
           <w:color w:val="1A1A1A"/>
           <w:sz w:val="20"/>
         </w:rPr>
-        <w:t>Motivation.</w:t>
-      </w:r>
-      <w:r>
-        <w:rPr>
-          <w:rFonts w:ascii="Arial" w:hAnsi="Arial" w:eastAsia="Arial"/>
-          <w:b w:val="0"/>
-          <w:i w:val="0"/>
-          <w:color w:val="1A1A1A"/>
-          <w:sz w:val="20"/>
-        </w:rPr>
-        <w:t xml:space="preserve"> Standard kNN has three weaknesses on this data. (i) The majority vote favours large, dense classes: near the Dermason/Sira boundary most neighbours come from the bigger Dermason class (546 vs 400 beans). (ii) A few noisy or atypical neighbours (e.g. irregular Barbunya beans) can flip the vote. (iii) Votes ignore how close the neighbours are and can produce ties.</w:t>
+        <w:t>Looking at the kNN errors, I thought the majority vote itself was part of the problem. Near the Dermason/Sira border most neighbours tend to be Dermason simply because there are more of them (546 vs 400). One odd neighbour also counts as a full vote, and the vote ignores how close each neighbour actually is.</w:t>
       </w:r>
     </w:p>
     <w:p>
@@ -1523,42 +1248,12 @@
       <w:r>
         <w:rPr>
           <w:rFonts w:ascii="Arial" w:hAnsi="Arial" w:eastAsia="Arial"/>
-          <w:b/>
+          <w:b w:val="0"/>
           <w:i w:val="0"/>
           <w:color w:val="1A1A1A"/>
           <w:sz w:val="20"/>
         </w:rPr>
-        <w:t>Modification of the prediction mechanism.</w:t>
-      </w:r>
-      <w:r>
-        <w:rPr>
-          <w:rFonts w:ascii="Arial" w:hAnsi="Arial" w:eastAsia="Arial"/>
-          <w:b w:val="0"/>
-          <w:i w:val="0"/>
-          <w:color w:val="1A1A1A"/>
-          <w:sz w:val="20"/>
-        </w:rPr>
-        <w:t xml:space="preserve"> I implemented, from scratch as a scikit-learn estimator, the </w:t>
-      </w:r>
-      <w:r>
-        <w:rPr>
-          <w:rFonts w:ascii="Arial" w:hAnsi="Arial" w:eastAsia="Arial"/>
-          <w:b w:val="0"/>
-          <w:i/>
-          <w:color w:val="1A1A1A"/>
-          <w:sz w:val="20"/>
-        </w:rPr>
-        <w:t>local mean-based kNN</w:t>
-      </w:r>
-      <w:r>
-        <w:rPr>
-          <w:rFonts w:ascii="Arial" w:hAnsi="Arial" w:eastAsia="Arial"/>
-          <w:b w:val="0"/>
-          <w:i w:val="0"/>
-          <w:color w:val="1A1A1A"/>
-          <w:sz w:val="20"/>
-        </w:rPr>
-        <w:t xml:space="preserve"> rule (LMKNN; Mitani &amp; Hamamoto, 2006), which changes how neighbours contribute to the decision:</w:t>
+        <w:t>I therefore changed how the neighbours are used, following the local mean-based kNN idea of Mitani and Hamamoto (2006). I wrote the classifier myself as a scikit-learn style class. For a new bean x:</w:t>
       </w:r>
     </w:p>
     <w:p>
@@ -1585,42 +1280,12 @@
       <w:r>
         <w:rPr>
           <w:rFonts w:ascii="Arial" w:hAnsi="Arial" w:eastAsia="Arial"/>
-          <w:b/>
+          <w:b w:val="0"/>
           <w:i w:val="0"/>
           <w:color w:val="1A1A1A"/>
           <w:sz w:val="20"/>
         </w:rPr>
-        <w:t>Class-conditional neighbours.</w:t>
-      </w:r>
-      <w:r>
-        <w:rPr>
-          <w:rFonts w:ascii="Arial" w:hAnsi="Arial" w:eastAsia="Arial"/>
-          <w:b w:val="0"/>
-          <w:i w:val="0"/>
-          <w:color w:val="1A1A1A"/>
-          <w:sz w:val="20"/>
-        </w:rPr>
-        <w:t xml:space="preserve"> For a query bean x, the k nearest neighbours are searched separately </w:t>
-      </w:r>
-      <w:r>
-        <w:rPr>
-          <w:rFonts w:ascii="Arial" w:hAnsi="Arial" w:eastAsia="Arial"/>
-          <w:b w:val="0"/>
-          <w:i/>
-          <w:color w:val="1A1A1A"/>
-          <w:sz w:val="20"/>
-        </w:rPr>
-        <w:t>within each class</w:t>
-      </w:r>
-      <w:r>
-        <w:rPr>
-          <w:rFonts w:ascii="Arial" w:hAnsi="Arial" w:eastAsia="Arial"/>
-          <w:b w:val="0"/>
-          <w:i w:val="0"/>
-          <w:color w:val="1A1A1A"/>
-          <w:sz w:val="20"/>
-        </w:rPr>
-        <w:t>, so every class gets exactly k representatives regardless of its size or local density.</w:t>
+        <w:t>for each class separately, it finds the k training beans of that class that are closest to x;</w:t>
       </w:r>
     </w:p>
     <w:p>
@@ -1647,22 +1312,12 @@
       <w:r>
         <w:rPr>
           <w:rFonts w:ascii="Arial" w:hAnsi="Arial" w:eastAsia="Arial"/>
-          <w:b/>
+          <w:b w:val="0"/>
           <w:i w:val="0"/>
           <w:color w:val="1A1A1A"/>
           <w:sz w:val="20"/>
         </w:rPr>
-        <w:t>Local means instead of votes.</w:t>
-      </w:r>
-      <w:r>
-        <w:rPr>
-          <w:rFonts w:ascii="Arial" w:hAnsi="Arial" w:eastAsia="Arial"/>
-          <w:b w:val="0"/>
-          <w:i w:val="0"/>
-          <w:color w:val="1A1A1A"/>
-          <w:sz w:val="20"/>
-        </w:rPr>
-        <w:t xml:space="preserve"> The k neighbours of class c are averaged into a local mean vector m_c(x) = (1/k)·Σ x_i^c. This acts as a local class centroid that adapts to where the query lies, and averaging cancels the effect of single noisy neighbours.</w:t>
+        <w:t>it averages those k beans into one 'local mean' point for that class;</w:t>
       </w:r>
     </w:p>
     <w:p>
@@ -1689,22 +1344,12 @@
       <w:r>
         <w:rPr>
           <w:rFonts w:ascii="Arial" w:hAnsi="Arial" w:eastAsia="Arial"/>
-          <w:b/>
+          <w:b w:val="0"/>
           <w:i w:val="0"/>
           <w:color w:val="1A1A1A"/>
           <w:sz w:val="20"/>
         </w:rPr>
-        <w:t>Distance-based decision.</w:t>
-      </w:r>
-      <w:r>
-        <w:rPr>
-          <w:rFonts w:ascii="Arial" w:hAnsi="Arial" w:eastAsia="Arial"/>
-          <w:b w:val="0"/>
-          <w:i w:val="0"/>
-          <w:color w:val="1A1A1A"/>
-          <w:sz w:val="20"/>
-        </w:rPr>
-        <w:t xml:space="preserve"> x is assigned to the class whose local mean is closest, ŷ = argmin_c ‖x − m_c(x)‖. The decision uses continuous distances, so voting ties disappear. With k = 1 the rule equals 1-NN, and as k approaches the class size it becomes a nearest-centroid classifier, so k gives a smooth bias–variance trade-off.</w:t>
+        <w:t>it predicts the class whose local mean is closest to x.</w:t>
       </w:r>
     </w:p>
     <w:p>
@@ -1721,7 +1366,7 @@
           <w:color w:val="1A1A1A"/>
           <w:sz w:val="20"/>
         </w:rPr>
-        <w:t>I also implemented a multi-scale extension, the local mean-based pseudo nearest neighbour (LMPNN; Gou et al., 2014). It computes the local means of the first 1, 2, …, k neighbours of each class and scores each class by the weighted sum Σ_j (1/j)·‖x − m_c^j(x)‖. Both variants use the same standardisation pipeline, CV folds, k range (1–40), selection metric and test split as the original kNN.</w:t>
+        <w:t>This changes three things. Every class gets exactly k representatives, so a big class cannot win just by being big. Averaging smooths out single noisy beans. And the decision is a distance, not a vote, so there are no ties. With k = 1 it behaves exactly like 1-NN, and with very large k it becomes a 'closest class centre' rule. I also tried a weighted version that combines local means of 1, 2, …, k neighbours (LMPNN, Gou et al., 2014). Both versions used the same pipeline, the same folds, the same k range and the same test split as the original kNN.</w:t>
       </w:r>
     </w:p>
     <w:p>
@@ -1748,7 +1393,7 @@
           <w:color w:val="404040"/>
           <w:sz w:val="17"/>
         </w:rPr>
-        <w:t>Classification results. CV = repeated 10-fold CV on the training set; test = 400 held-out beans.</w:t>
+        <w:t>Classification results (CV = repeated cross-validation on the training set; test = 400 beans).</w:t>
       </w:r>
     </w:p>
     <w:tbl>
@@ -2197,7 +1842,7 @@
                 <w:color w:val="1A1A1A"/>
                 <w:sz w:val="17"/>
               </w:rPr>
-              <w:t>LMKNN (proposed, 2.2B)</w:t>
+              <w:t>Local mean kNN (2.2B)</w:t>
             </w:r>
           </w:p>
         </w:tc>
@@ -2398,7 +2043,7 @@
                 <w:color w:val="1A1A1A"/>
                 <w:sz w:val="17"/>
               </w:rPr>
-              <w:t>LMPNN (extension)</w:t>
+              <w:t>Weighted version (LMPNN)</w:t>
             </w:r>
           </w:p>
         </w:tc>
@@ -2782,22 +2427,12 @@
       <w:r>
         <w:rPr>
           <w:rFonts w:ascii="Arial" w:hAnsi="Arial" w:eastAsia="Arial"/>
-          <w:b/>
+          <w:b w:val="0"/>
           <w:i w:val="0"/>
           <w:color w:val="1A1A1A"/>
           <w:sz w:val="20"/>
         </w:rPr>
-        <w:t>Results.</w:t>
-      </w:r>
-      <w:r>
-        <w:rPr>
-          <w:rFonts w:ascii="Arial" w:hAnsi="Arial" w:eastAsia="Arial"/>
-          <w:b w:val="0"/>
-          <w:i w:val="0"/>
-          <w:color w:val="1A1A1A"/>
-          <w:sz w:val="20"/>
-        </w:rPr>
-        <w:t xml:space="preserve"> LMKNN obtained the best CV macro-F1 (0.936 at k = 9) and was selected as the proposed model. It also improved every test metric over the original kNN: accuracy rose from 0.923 to 0.935 (26 instead of 31 errors) and macro-F1 from 0.929 to 0.938 (Table 2, Figure 4b). The per-class view (Figure 4c) shows that the gains are concentrated where the motivation predicted, in the overlapping small-bean group of different sizes: Dermason F1 0.927→0.950, Sira 0.896→0.915, Seker 0.954→0.972. Sira→Dermason errors fell from 7 to 5, Dermason→Sira from 6 to 5, and Dermason→Seker from 2 to 0. Figure 4a also shows the different mechanisms. The original kNN degrades for larger k, as large classes increasingly dominate the vote. LMKNN stays above kNN for all k ≥ 5, and LMPNN rises steadily and is the least sensitive to large k, because its 1/j weights keep the nearest neighbours dominant.</w:t>
+        <w:t>The simple local mean version had the best cross-validation score (k = 9), so that is my proposed model. It beat the original kNN on every test metric: accuracy went from 0.923 to 0.935 (26 errors instead of 31) and macro F1 from 0.929 to 0.938 (Table 2, Figure 4b). The gains are where I expected them, in the similar-looking small beans. Dermason F1 went from 0.927 to 0.950, Sira from 0.896 to 0.915 and Seker from 0.954 to 0.972 (Figure 4c). Figure 4a also shows that the original kNN gets worse as k grows, while both local mean versions stay higher and are less affected by the choice of k.</w:t>
       </w:r>
     </w:p>
     <w:p>
@@ -2809,22 +2444,12 @@
       <w:r>
         <w:rPr>
           <w:rFonts w:ascii="Arial" w:hAnsi="Arial" w:eastAsia="Arial"/>
-          <w:b/>
+          <w:b w:val="0"/>
           <w:i w:val="0"/>
           <w:color w:val="1A1A1A"/>
           <w:sz w:val="20"/>
         </w:rPr>
-        <w:t>Does it improve performance?</w:t>
-      </w:r>
-      <w:r>
-        <w:rPr>
-          <w:rFonts w:ascii="Arial" w:hAnsi="Arial" w:eastAsia="Arial"/>
-          <w:b w:val="0"/>
-          <w:i w:val="0"/>
-          <w:color w:val="1A1A1A"/>
-          <w:sz w:val="20"/>
-        </w:rPr>
-        <w:t xml:space="preserve"> Yes, consistently but modestly. The improvement appears both in CV (+0.45 pp macro-F1) and on the test set (+1.25 pp accuracy). However, an exact McNemar test on the paired test predictions (7 beans corrected only by LMKNN versus 2 only by kNN) gives p = 0.18, so the difference is not statistically significant with 400 test beans. The modification helps when classes overlap and differ in size or density, because a local centroid per class estimates the class-conditional structure around x better than a vote dominated by the larger class. It cannot help Barbunya and Cali (F1 unchanged at 0.892 and 0.879), whose overlap is genuine in this feature space (Figure 8a): no rule based on Euclidean distance separates them. Too large a k pulls the local mean across curved class boundaries (bias), which is why the best k is smaller than for kNN. The cost is small: prediction needs one neighbour search per class (14 ms vs 9 ms for 400 beans). LMKNN still depends on scaling and on a Euclidean metric in which the many correlated size features are over-weighted, which also limits the gain.</w:t>
+        <w:t>I would call this a real but small improvement. It shows up in cross-validation and on the test set. However, only 9 test beans are right for one model and wrong for the other (7 in favour of the new method, 2 against), and a McNemar test gives p = 0.18, so 400 test beans are not enough to prove it statistically. It helps when classes overlap and differ in size, but it did nothing for Barbunya and Cali (F1 unchanged), because those two really do overlap in this feature space (Figure 8a), and no distance-based rule can separate beans that sit on top of each other. If k is too large, the local mean also gets pulled across the class border, which is why the best k is smaller than for normal kNN. The extra cost is small: predicting the 400 test beans took 14 ms instead of 9 ms.</w:t>
       </w:r>
     </w:p>
     <w:p>
@@ -2891,7 +2516,7 @@
           <w:color w:val="404040"/>
           <w:sz w:val="17"/>
         </w:rPr>
-        <w:t>(a) CV macro-F1 versus k for the original kNN and the two local-mean modifications; (b) test-set metrics on the same split; (c) per-class test F1. Colours are consistent across panels.</w:t>
+        <w:t>(a) Cross-validated macro F1 against k for the original kNN and the two local mean versions; (b) test metrics on the same split; (c) test F1 for each class.</w:t>
       </w:r>
     </w:p>
     <w:p>
@@ -2922,7 +2547,7 @@
           <w:color w:val="1A1A1A"/>
           <w:sz w:val="20"/>
         </w:rPr>
-        <w:t xml:space="preserve">A decision tree splits on one feature threshold at a time, so it is scale-invariant and needs no standardisation. Its key complexity parameters were tuned jointly with the same 30-fold CV and macro-F1 criterion: </w:t>
+        <w:t xml:space="preserve">A decision tree splits on one feature at a time, so it does not need scaling. I tuned the tree depth (1–20 or unlimited), the minimum number of beans per leaf (1, 2, 5, 10 or 20) and the split criterion (Gini or entropy) together, using the same cross-validation. The best combination was </w:t>
       </w:r>
       <w:r>
         <w:rPr>
@@ -2932,7 +2557,7 @@
           <w:color w:val="1A1A1A"/>
           <w:sz w:val="20"/>
         </w:rPr>
-        <w:t>max_depth</w:t>
+        <w:t>entropy, depth 6 and at least 10 beans per leaf</w:t>
       </w:r>
       <w:r>
         <w:rPr>
@@ -2942,67 +2567,7 @@
           <w:color w:val="1A1A1A"/>
           <w:sz w:val="20"/>
         </w:rPr>
-        <w:t xml:space="preserve"> (1–20 and unlimited), </w:t>
-      </w:r>
-      <w:r>
-        <w:rPr>
-          <w:rFonts w:ascii="Arial" w:hAnsi="Arial" w:eastAsia="Arial"/>
-          <w:b/>
-          <w:i w:val="0"/>
-          <w:color w:val="1A1A1A"/>
-          <w:sz w:val="20"/>
-        </w:rPr>
-        <w:t>min_samples_leaf</w:t>
-      </w:r>
-      <w:r>
-        <w:rPr>
-          <w:rFonts w:ascii="Arial" w:hAnsi="Arial" w:eastAsia="Arial"/>
-          <w:b w:val="0"/>
-          <w:i w:val="0"/>
-          <w:color w:val="1A1A1A"/>
-          <w:sz w:val="20"/>
-        </w:rPr>
-        <w:t xml:space="preserve"> (1, 2, 5, 10, 20) and the split </w:t>
-      </w:r>
-      <w:r>
-        <w:rPr>
-          <w:rFonts w:ascii="Arial" w:hAnsi="Arial" w:eastAsia="Arial"/>
-          <w:b/>
-          <w:i w:val="0"/>
-          <w:color w:val="1A1A1A"/>
-          <w:sz w:val="20"/>
-        </w:rPr>
-        <w:t>criterion</w:t>
-      </w:r>
-      <w:r>
-        <w:rPr>
-          <w:rFonts w:ascii="Arial" w:hAnsi="Arial" w:eastAsia="Arial"/>
-          <w:b w:val="0"/>
-          <w:i w:val="0"/>
-          <w:color w:val="1A1A1A"/>
-          <w:sz w:val="20"/>
-        </w:rPr>
-        <w:t xml:space="preserve"> (Gini or entropy), 210 combinations in total. The best tree uses </w:t>
-      </w:r>
-      <w:r>
-        <w:rPr>
-          <w:rFonts w:ascii="Arial" w:hAnsi="Arial" w:eastAsia="Arial"/>
-          <w:b/>
-          <w:i w:val="0"/>
-          <w:color w:val="1A1A1A"/>
-          <w:sz w:val="20"/>
-        </w:rPr>
-        <w:t>entropy, max_depth = 6 and min_samples_leaf = 10</w:t>
-      </w:r>
-      <w:r>
-        <w:rPr>
-          <w:rFonts w:ascii="Arial" w:hAnsi="Arial" w:eastAsia="Arial"/>
-          <w:b w:val="0"/>
-          <w:i w:val="0"/>
-          <w:color w:val="1A1A1A"/>
-          <w:sz w:val="20"/>
-        </w:rPr>
-        <w:t xml:space="preserve"> (CV macro-F1 0.907; the final tree has 38 leaves). The validation curve (Figure 5a) justifies this choice. Trees with depth ≤ 4 underfit (depth 3: F1 0.75). The validation score peaks at depth 6 and then stays flat or falls slightly while the training score keeps rising, so deeper trees only add complexity. An unpruned tree reaches a training F1 of 1.000 but a CV F1 of only 0.895, which is clear overfitting. A minimum of 10 beans per leaf stops leaves from memorising individual beans.</w:t>
+        <w:t xml:space="preserve"> (CV macro F1 0.907), which gives a tree with 38 leaves. The validation curve in Figure 5a explains why I settled on depth 6. Shallower trees underfit (depth 3 only reaches 0.75), the validation score peaks at 6, and deeper trees only improve the training score. A fully grown tree scores 1.000 on training data but only 0.895 in cross-validation, which is clear overfitting. The 10-bean minimum stops leaves from being built around single beans.</w:t>
       </w:r>
     </w:p>
     <w:p>
@@ -3014,22 +2579,12 @@
       <w:r>
         <w:rPr>
           <w:rFonts w:ascii="Arial" w:hAnsi="Arial" w:eastAsia="Arial"/>
-          <w:b/>
+          <w:b w:val="0"/>
           <w:i w:val="0"/>
           <w:color w:val="1A1A1A"/>
           <w:sz w:val="20"/>
         </w:rPr>
-        <w:t>Comparison with the original kNN.</w:t>
-      </w:r>
-      <w:r>
-        <w:rPr>
-          <w:rFonts w:ascii="Arial" w:hAnsi="Arial" w:eastAsia="Arial"/>
-          <w:b w:val="0"/>
-          <w:i w:val="0"/>
-          <w:color w:val="1A1A1A"/>
-          <w:sz w:val="20"/>
-        </w:rPr>
-        <w:t xml:space="preserve"> On the test set the tree reaches accuracy 0.873, macro precision 0.880, recall 0.879 and F1 0.879, about 5 percentage points below kNN on every metric (Table 2, Figure 5b). The CV gap is smaller (0.907 vs 0.931), so part of the test gap is sampling noise, but kNN is better on both. The tree's weakest classes are Barbunya (F1 0.73; 9 of 38 predicted as Cali), Sira (0.82) and Cali (0.83). Bombay (1.00) and Seker (0.96) remain easy. The feature importances (Figure 5c) show that the tree first uses size (MajorAxisLength 0.33, MinorAxisLength 0.15) and then shape (ShapeFactor1 0.16, ShapeFactor3 0.09). Redundant copies of size, such as ConvexArea and EquivDiameter, receive zero importance because the tree only needs one variable from each correlated group.</w:t>
+        <w:t>On the test set the tree got an accuracy of 0.873 and a macro F1 of 0.879, about 5 points below kNN on every metric (Table 2, Figure 5b). Its cross-validation score was also lower (0.907 vs 0.931), so this was not just a bad split. The tree struggled most with Barbunya (F1 0.73, with 9 of 38 called Cali), Sira (0.82) and Cali (0.83). Figure 5c shows that it relies mostly on size (MajorAxisLength, MinorAxisLength) and then on shape (ShapeFactor1 and 3). Duplicate size measures such as ConvexArea were not used at all.</w:t>
       </w:r>
     </w:p>
     <w:p>
@@ -3041,12 +2596,12 @@
       <w:r>
         <w:rPr>
           <w:rFonts w:ascii="Arial" w:hAnsi="Arial" w:eastAsia="Arial"/>
-          <w:b/>
+          <w:b w:val="0"/>
           <w:i w:val="0"/>
           <w:color w:val="1A1A1A"/>
           <w:sz w:val="20"/>
         </w:rPr>
-        <w:t>Strengths and weaknesses of each model on this dataset:</w:t>
+        <w:t>Comparing the two models on this dataset:</w:t>
       </w:r>
     </w:p>
     <w:p>
@@ -3078,7 +2633,7 @@
           <w:color w:val="1A1A1A"/>
           <w:sz w:val="20"/>
         </w:rPr>
-        <w:t>Predictive performance.</w:t>
+        <w:t>Predictive performance:</w:t>
       </w:r>
       <w:r>
         <w:rPr>
@@ -3088,7 +2643,7 @@
           <w:color w:val="1A1A1A"/>
           <w:sz w:val="20"/>
         </w:rPr>
-        <w:t xml:space="preserve"> kNN wins. The boundaries between varieties are smooth, oblique combinations of correlated size and shape features (e.g. Dermason versus Sira lie along a size–shape diagonal). A tree can only approximate such boundaries with axis-parallel 'staircases', which needs many splits and therefore more data, whereas kNN adapts locally.</w:t>
+        <w:t xml:space="preserve"> kNN is clearly better. The borders between bean types are smooth diagonal mixes of size and shape, which kNN can follow. A tree can only make straight cuts on one feature at a time, so it needs many steps to follow a diagonal border.</w:t>
       </w:r>
     </w:p>
     <w:p>
@@ -3120,7 +2675,7 @@
           <w:color w:val="1A1A1A"/>
           <w:sz w:val="20"/>
         </w:rPr>
-        <w:t>Interpretability.</w:t>
+        <w:t>Interpretability:</w:t>
       </w:r>
       <w:r>
         <w:rPr>
@@ -3130,27 +2685,7 @@
           <w:color w:val="1A1A1A"/>
           <w:sz w:val="20"/>
         </w:rPr>
-        <w:t xml:space="preserve"> The tree wins. Its 38 if–then rules and feature importances explain </w:t>
-      </w:r>
-      <w:r>
-        <w:rPr>
-          <w:rFonts w:ascii="Arial" w:hAnsi="Arial" w:eastAsia="Arial"/>
-          <w:b w:val="0"/>
-          <w:i/>
-          <w:color w:val="1A1A1A"/>
-          <w:sz w:val="20"/>
-        </w:rPr>
-        <w:t>why</w:t>
-      </w:r>
-      <w:r>
-        <w:rPr>
-          <w:rFonts w:ascii="Arial" w:hAnsi="Arial" w:eastAsia="Arial"/>
-          <w:b w:val="0"/>
-          <w:i w:val="0"/>
-          <w:color w:val="1A1A1A"/>
-          <w:sz w:val="20"/>
-        </w:rPr>
-        <w:t xml:space="preserve"> a bean is classified (e.g. Bombay is isolated by a single size threshold). kNN has no global model; it can only justify a prediction by pointing to similar beans.</w:t>
+        <w:t xml:space="preserve"> the tree wins. I can read its rules and see which features matter (for example, Bombay is separated by a single size cut). kNN cannot give a reason beyond 'these beans look similar'.</w:t>
       </w:r>
     </w:p>
     <w:p>
@@ -3182,7 +2717,7 @@
           <w:color w:val="1A1A1A"/>
           <w:sz w:val="20"/>
         </w:rPr>
-        <w:t>Model complexity and cost.</w:t>
+        <w:t>Complexity:</w:t>
       </w:r>
       <w:r>
         <w:rPr>
@@ -3192,7 +2727,7 @@
           <w:color w:val="1A1A1A"/>
           <w:sz w:val="20"/>
         </w:rPr>
-        <w:t xml:space="preserve"> kNN is a lazy learner. It has almost no training cost, but it must store all 1,600 training beans and compute distances to them for every prediction. The tree is a compact model of depth 6, slower to train (23 ms vs 7 ms) but faster to predict (2.5 ms vs 5.5 ms), and it scales better to large data.</w:t>
+        <w:t xml:space="preserve"> kNN has almost no training step, but it must keep all 1,600 training beans and compare every new bean with all of them. The tree takes a little longer to train (23 ms vs 7 ms) but is a small model that predicts faster (2.5 ms vs 5.5 ms).</w:t>
       </w:r>
     </w:p>
     <w:p>
@@ -3224,7 +2759,7 @@
           <w:color w:val="1A1A1A"/>
           <w:sz w:val="20"/>
         </w:rPr>
-        <w:t>Sensitivity to data characteristics.</w:t>
+        <w:t>Sensitivity to the data:</w:t>
       </w:r>
       <w:r>
         <w:rPr>
@@ -3234,7 +2769,7 @@
           <w:color w:val="1A1A1A"/>
           <w:sz w:val="20"/>
         </w:rPr>
-        <w:t xml:space="preserve"> kNN is very sensitive to feature scaling (0.63 vs 0.93), to redundant or irrelevant features (here eight correlated size variables share the distance), to noise when k is small, and to class imbalance. The tree is insensitive to scaling and monotone transformations and ignores irrelevant features, but it has high variance: small changes in the data can change the splits, and it overfits without depth or leaf constraints. Its leaves give little support to small classes.</w:t>
+        <w:t xml:space="preserve"> kNN depends heavily on scaling (0.63 vs 0.93), on duplicated features and on k. The tree does not care about scaling and ignores useless features, but small changes in the data can change its splits, and it overfits if depth is not limited.</w:t>
       </w:r>
     </w:p>
     <w:p>
@@ -3251,7 +2786,7 @@
           <w:color w:val="1A1A1A"/>
           <w:sz w:val="20"/>
         </w:rPr>
-        <w:t>Overall, kNN (and its local-mean modification) is preferable when accuracy matters, and the tree is preferable when an explainable rule set is required. Tree ensembles such as random forests would reduce the tree's variance and narrow the accuracy gap.</w:t>
+        <w:t>If accuracy is the goal I would use kNN (or the local mean version). If the result has to be explained to someone, the tree is the better choice.</w:t>
       </w:r>
     </w:p>
     <w:p>
@@ -3318,7 +2853,7 @@
           <w:color w:val="404040"/>
           <w:sz w:val="17"/>
         </w:rPr>
-        <w:t>(a) Training versus validation macro-F1 over max_depth for the best criterion and leaf size; (b) kNN versus Decision Tree on test metrics and CV macro-F1; (c) the eight most important tree features.</w:t>
+        <w:t>(a) Training and validation macro F1 against tree depth; (b) kNN and the decision tree on the same metrics; (c) the eight most important tree features.</w:t>
       </w:r>
     </w:p>
     <w:p>
@@ -3349,27 +2884,7 @@
           <w:color w:val="1A1A1A"/>
           <w:sz w:val="20"/>
         </w:rPr>
-        <w:t xml:space="preserve">Sample Three (2,000 beans) was used with all 16 inputs. The Class column was removed before any modelling. It was </w:t>
-      </w:r>
-      <w:r>
-        <w:rPr>
-          <w:rFonts w:ascii="Arial" w:hAnsi="Arial" w:eastAsia="Arial"/>
-          <w:b/>
-          <w:i w:val="0"/>
-          <w:color w:val="1A1A1A"/>
-          <w:sz w:val="20"/>
-        </w:rPr>
-        <w:t>never used to fit a model or choose a parameter</w:t>
-      </w:r>
-      <w:r>
-        <w:rPr>
-          <w:rFonts w:ascii="Arial" w:hAnsi="Arial" w:eastAsia="Arial"/>
-          <w:b w:val="0"/>
-          <w:i w:val="0"/>
-          <w:color w:val="1A1A1A"/>
-          <w:sz w:val="20"/>
-        </w:rPr>
-        <w:t>, only afterwards for external evaluation (adjusted Rand index, ARI; normalised mutual information, NMI; homogeneity; completeness; contingency tables). The inputs were z-standardised, because distance-based clustering would otherwise be driven by Area and ConvexArea. Internal quality was measured with the silhouette coefficient (higher is better; Rousseeuw, 1987), the Davies–Bouldin index (lower is better) and the Calinski–Harabasz index (higher is better). ARI is 0 for random labels and 1 for perfect agreement (Hubert &amp; Arabie, 1985). Note that 21 of the 120 feature pairs have |r| &gt; 0.9.</w:t>
+        <w:t>For this task I used Sample Three (2,000 beans) and all 16 features. I removed the Class column before clustering and did not use it to choose any settings. It was only used afterwards to check how well the clusters matched the real bean types, using the adjusted Rand index (ARI, 0 = random, 1 = perfect) and normalised mutual information (NMI). All features were standardised first. To measure cluster quality without labels I used the silhouette score (higher is better), the Davies–Bouldin index (lower is better) and the Calinski–Harabasz index (higher is better).</w:t>
       </w:r>
     </w:p>
     <w:p>
@@ -3400,7 +2915,7 @@
           <w:color w:val="1A1A1A"/>
           <w:sz w:val="20"/>
         </w:rPr>
-        <w:t xml:space="preserve">k-Means (k-means++ initialisation, 10 restarts) was run for k = 2–12 (Figure 6). The criteria do not fully agree. The elbow of the inertia curve (the point farthest from the chord between the first and last points, a 'kneedle'-style rule; Satopää et al., 2011) is k = 5. The silhouette is highest at </w:t>
+        <w:t xml:space="preserve">I ran k-Means for k = 2 to 12 (Figure 6). The measures did not all agree. The elbow of the inertia curve is around k = 5, but it is not a sharp bend. The silhouette is highest at k = 3 (0.403), Davies–Bouldin is lowest at k = 3 (0.910), and Calinski–Harabasz prefers k = 2. Since two of the measures clearly point to it, I chose </w:t>
       </w:r>
       <w:r>
         <w:rPr>
@@ -3420,47 +2935,7 @@
           <w:color w:val="1A1A1A"/>
           <w:sz w:val="20"/>
         </w:rPr>
-        <w:t xml:space="preserve"> (0.403), Davies–Bouldin is lowest at </w:t>
-      </w:r>
-      <w:r>
-        <w:rPr>
-          <w:rFonts w:ascii="Arial" w:hAnsi="Arial" w:eastAsia="Arial"/>
-          <w:b/>
-          <w:i w:val="0"/>
-          <w:color w:val="1A1A1A"/>
-          <w:sz w:val="20"/>
-        </w:rPr>
-        <w:t>k = 3</w:t>
-      </w:r>
-      <w:r>
-        <w:rPr>
-          <w:rFonts w:ascii="Arial" w:hAnsi="Arial" w:eastAsia="Arial"/>
-          <w:b w:val="0"/>
-          <w:i w:val="0"/>
-          <w:color w:val="1A1A1A"/>
-          <w:sz w:val="20"/>
-        </w:rPr>
-        <w:t xml:space="preserve"> (0.910), and Calinski–Harabasz is highest at k = 2. Taking the majority of these internal criteria, </w:t>
-      </w:r>
-      <w:r>
-        <w:rPr>
-          <w:rFonts w:ascii="Arial" w:hAnsi="Arial" w:eastAsia="Arial"/>
-          <w:b/>
-          <w:i w:val="0"/>
-          <w:color w:val="1A1A1A"/>
-          <w:sz w:val="20"/>
-        </w:rPr>
-        <w:t>k = 3</w:t>
-      </w:r>
-      <w:r>
-        <w:rPr>
-          <w:rFonts w:ascii="Arial" w:hAnsi="Arial" w:eastAsia="Arial"/>
-          <w:b w:val="0"/>
-          <w:i w:val="0"/>
-          <w:color w:val="1A1A1A"/>
-          <w:sz w:val="20"/>
-        </w:rPr>
-        <w:t xml:space="preserve"> was chosen. It is a clear joint optimum of the two separation-based indices, while the inertia curve declines smoothly with only a weak elbow.</w:t>
+        <w:t>.</w:t>
       </w:r>
     </w:p>
     <w:p>
@@ -3527,7 +3002,7 @@
           <w:color w:val="404040"/>
           <w:sz w:val="17"/>
         </w:rPr>
-        <w:t>Effect of the number of clusters k on (a) inertia, (b) silhouette, (c) Davies–Bouldin and (d) Calinski–Harabasz for k-Means; the dashed line marks the chosen k = 3.</w:t>
+        <w:t>How k affects (a) inertia, (b) silhouette, (c) Davies–Bouldin and (d) Calinski–Harabasz. The dashed line marks k = 3.</w:t>
       </w:r>
     </w:p>
     <w:p>
@@ -3554,7 +3029,7 @@
           <w:color w:val="404040"/>
           <w:sz w:val="17"/>
         </w:rPr>
-        <w:t>k-Means (k = 3) clusters versus the true classes (contingency table) and mean cluster profiles.</w:t>
+        <w:t>The three k-Means clusters compared with the real classes, plus average size and shape.</w:t>
       </w:r>
     </w:p>
     <w:tbl>
@@ -4723,42 +4198,12 @@
       <w:r>
         <w:rPr>
           <w:rFonts w:ascii="Arial" w:hAnsi="Arial" w:eastAsia="Arial"/>
-          <w:b/>
+          <w:b w:val="0"/>
           <w:i w:val="0"/>
           <w:color w:val="1A1A1A"/>
           <w:sz w:val="20"/>
         </w:rPr>
-        <w:t>Results and interpretation.</w:t>
-      </w:r>
-      <w:r>
-        <w:rPr>
-          <w:rFonts w:ascii="Arial" w:hAnsi="Arial" w:eastAsia="Arial"/>
-          <w:b w:val="0"/>
-          <w:i w:val="0"/>
-          <w:color w:val="1A1A1A"/>
-          <w:sz w:val="20"/>
-        </w:rPr>
-        <w:t xml:space="preserve"> The k = 3 solution has silhouette 0.403, DB 0.910 and CH 1,288. Against the varieties it reaches ARI 0.306 and NMI 0.495, with high completeness (0.80) but low homogeneity (0.36). In other words, each variety is mostly kept together, but clusters mix several varieties. Table 3 and Figure 8b show that k-Means recovers a </w:t>
-      </w:r>
-      <w:r>
-        <w:rPr>
-          <w:rFonts w:ascii="Arial" w:hAnsi="Arial" w:eastAsia="Arial"/>
-          <w:b/>
-          <w:i w:val="0"/>
-          <w:color w:val="1A1A1A"/>
-          <w:sz w:val="20"/>
-        </w:rPr>
-        <w:t>size-driven grouping</w:t>
-      </w:r>
-      <w:r>
-        <w:rPr>
-          <w:rFonts w:ascii="Arial" w:hAnsi="Arial" w:eastAsia="Arial"/>
-          <w:b w:val="0"/>
-          <w:i w:val="0"/>
-          <w:color w:val="1A1A1A"/>
-          <w:sz w:val="20"/>
-        </w:rPr>
-        <w:t>: a very large cluster (81 of 81 Bombay beans), a small and round cluster (Dermason, Seker and most Sira; aspect ratio 1.43) and a medium-to-large, more elongated cluster (Horoz, Cali and Barbunya; aspect ratio 1.78). For reference only, k = 7 (the number of registered varieties) would give ARI 0.653 but a lower silhouette (0.303). The varieties overlap and are not separated by gaps, so internal criteria do not favour them.</w:t>
+        <w:t>With k = 3 the silhouette is 0.403, Davies–Bouldin 0.910 and Calinski–Harabasz 1,288. Against the real classes the ARI is 0.306 and the NMI 0.495. Table 3 shows what happened: k-Means grouped the beans mainly by size. One cluster is almost entirely Bombay (very large), one holds the small, rounder beans (Dermason, Seker and most Sira) and one holds the medium, longer beans (Horoz, Cali, Barbunya). Each bean type mostly stays together, but each cluster mixes several types. Out of interest I also checked k = 7 (the number of bean types) without using it for the choice. It gave a much better ARI (0.653) but a worse silhouette (0.303), because the seven types touch each other without clear gaps.</w:t>
       </w:r>
     </w:p>
     <w:p>
@@ -4770,180 +4215,12 @@
       <w:r>
         <w:rPr>
           <w:rFonts w:ascii="Arial" w:hAnsi="Arial" w:eastAsia="Arial"/>
-          <w:b/>
+          <w:b w:val="0"/>
           <w:i w:val="0"/>
           <w:color w:val="1A1A1A"/>
           <w:sz w:val="20"/>
         </w:rPr>
-        <w:t>Limitations of k-Means for this dataset and possible solutions:</w:t>
-      </w:r>
-    </w:p>
-    <w:p>
-      <w:pPr>
-        <w:keepNext w:val="0"/>
-        <w:tabs>
-          <w:tab w:pos="255" w:val="left"/>
-        </w:tabs>
-        <w:spacing w:after="40" w:before="0" w:line="240" w:lineRule="auto"/>
-        <w:ind w:left="255" w:hanging="170"/>
-        <w:jc w:val="both"/>
-      </w:pPr>
-      <w:r>
-        <w:rPr>
-          <w:rFonts w:ascii="Arial" w:hAnsi="Arial" w:eastAsia="Arial"/>
-          <w:b w:val="0"/>
-          <w:i w:val="0"/>
-          <w:color w:val="1A1A1A"/>
-          <w:sz w:val="20"/>
-        </w:rPr>
-        <w:t>•</w:t>
-        <w:tab/>
-      </w:r>
-      <w:r>
-        <w:rPr>
-          <w:rFonts w:ascii="Arial" w:hAnsi="Arial" w:eastAsia="Arial"/>
-          <w:b/>
-          <w:i w:val="0"/>
-          <w:color w:val="1A1A1A"/>
-          <w:sz w:val="20"/>
-        </w:rPr>
-        <w:t>k must be given, and the indices disagree</w:t>
-      </w:r>
-      <w:r>
-        <w:rPr>
-          <w:rFonts w:ascii="Arial" w:hAnsi="Arial" w:eastAsia="Arial"/>
-          <w:b w:val="0"/>
-          <w:i w:val="0"/>
-          <w:color w:val="1A1A1A"/>
-          <w:sz w:val="20"/>
-        </w:rPr>
-        <w:t xml:space="preserve"> (2, 3 or 5). Possible solutions: stability-based selection, the gap statistic, domain knowledge, or a Gaussian mixture model with BIC.</w:t>
-      </w:r>
-    </w:p>
-    <w:p>
-      <w:pPr>
-        <w:keepNext w:val="0"/>
-        <w:tabs>
-          <w:tab w:pos="255" w:val="left"/>
-        </w:tabs>
-        <w:spacing w:after="40" w:before="0" w:line="240" w:lineRule="auto"/>
-        <w:ind w:left="255" w:hanging="170"/>
-        <w:jc w:val="both"/>
-      </w:pPr>
-      <w:r>
-        <w:rPr>
-          <w:rFonts w:ascii="Arial" w:hAnsi="Arial" w:eastAsia="Arial"/>
-          <w:b w:val="0"/>
-          <w:i w:val="0"/>
-          <w:color w:val="1A1A1A"/>
-          <w:sz w:val="20"/>
-        </w:rPr>
-        <w:t>•</w:t>
-        <w:tab/>
-      </w:r>
-      <w:r>
-        <w:rPr>
-          <w:rFonts w:ascii="Arial" w:hAnsi="Arial" w:eastAsia="Arial"/>
-          <w:b/>
-          <w:i w:val="0"/>
-          <w:color w:val="1A1A1A"/>
-          <w:sz w:val="20"/>
-        </w:rPr>
-        <w:t>Spherical, equal-variance assumption.</w:t>
-      </w:r>
-      <w:r>
-        <w:rPr>
-          <w:rFonts w:ascii="Arial" w:hAnsi="Arial" w:eastAsia="Arial"/>
-          <w:b w:val="0"/>
-          <w:i w:val="0"/>
-          <w:color w:val="1A1A1A"/>
-          <w:sz w:val="20"/>
-        </w:rPr>
-        <w:t xml:space="preserve"> The bean classes are elongated, correlated ellipsoids of very different sizes and densities, and the 82 Bombay beans are far from the rest (Figure 8a). Possible solution: a Gaussian mixture with full covariance matrices, or clustering in a decorrelated (Mahalanobis or whitened) space.</w:t>
-      </w:r>
-    </w:p>
-    <w:p>
-      <w:pPr>
-        <w:keepNext w:val="0"/>
-        <w:tabs>
-          <w:tab w:pos="255" w:val="left"/>
-        </w:tabs>
-        <w:spacing w:after="40" w:before="0" w:line="240" w:lineRule="auto"/>
-        <w:ind w:left="255" w:hanging="170"/>
-        <w:jc w:val="both"/>
-      </w:pPr>
-      <w:r>
-        <w:rPr>
-          <w:rFonts w:ascii="Arial" w:hAnsi="Arial" w:eastAsia="Arial"/>
-          <w:b w:val="0"/>
-          <w:i w:val="0"/>
-          <w:color w:val="1A1A1A"/>
-          <w:sz w:val="20"/>
-        </w:rPr>
-        <w:t>•</w:t>
-        <w:tab/>
-      </w:r>
-      <w:r>
-        <w:rPr>
-          <w:rFonts w:ascii="Arial" w:hAnsi="Arial" w:eastAsia="Arial"/>
-          <w:b/>
-          <w:i w:val="0"/>
-          <w:color w:val="1A1A1A"/>
-          <w:sz w:val="20"/>
-        </w:rPr>
-        <w:t>Redundant features bias the distance.</w:t>
-      </w:r>
-      <w:r>
-        <w:rPr>
-          <w:rFonts w:ascii="Arial" w:hAnsi="Arial" w:eastAsia="Arial"/>
-          <w:b w:val="0"/>
-          <w:i w:val="0"/>
-          <w:color w:val="1A1A1A"/>
-          <w:sz w:val="20"/>
-        </w:rPr>
-        <w:t xml:space="preserve"> About eight size variables (Area, Perimeter, both axes, ConvexArea, EquivDiameter, …) give 'size' several times more weight than shape, so the clusters follow size. Possible solutions: feature selection, feature weighting or PCA (examined in 3.3B).</w:t>
-      </w:r>
-    </w:p>
-    <w:p>
-      <w:pPr>
-        <w:keepNext w:val="0"/>
-        <w:tabs>
-          <w:tab w:pos="255" w:val="left"/>
-        </w:tabs>
-        <w:spacing w:after="40" w:before="0" w:line="240" w:lineRule="auto"/>
-        <w:ind w:left="255" w:hanging="170"/>
-        <w:jc w:val="both"/>
-      </w:pPr>
-      <w:r>
-        <w:rPr>
-          <w:rFonts w:ascii="Arial" w:hAnsi="Arial" w:eastAsia="Arial"/>
-          <w:b w:val="0"/>
-          <w:i w:val="0"/>
-          <w:color w:val="1A1A1A"/>
-          <w:sz w:val="20"/>
-        </w:rPr>
-        <w:t>•</w:t>
-        <w:tab/>
-      </w:r>
-      <w:r>
-        <w:rPr>
-          <w:rFonts w:ascii="Arial" w:hAnsi="Arial" w:eastAsia="Arial"/>
-          <w:b/>
-          <w:i w:val="0"/>
-          <w:color w:val="1A1A1A"/>
-          <w:sz w:val="20"/>
-        </w:rPr>
-        <w:t>Sensitivity to initialisation and outliers.</w:t>
-      </w:r>
-      <w:r>
-        <w:rPr>
-          <w:rFonts w:ascii="Arial" w:hAnsi="Arial" w:eastAsia="Arial"/>
-          <w:b w:val="0"/>
-          <w:i w:val="0"/>
-          <w:color w:val="1A1A1A"/>
-          <w:sz w:val="20"/>
-        </w:rPr>
-        <w:t xml:space="preserve"> The seed stability of a single run is only 0.84 (Table 5). Remedies: k-means++ with several restarts (used here), and robust scaling or k-medoids for outliers.</w:t>
+        <w:t>I noticed several limitations of k-Means here. First, k has to be chosen in advance, and the measures disagreed (2, 3 or 5); a stability check or the gap statistic could help. Second, k-Means expects round clusters of similar size, but the bean groups are stretched, overlapping and very different in size (82 Bombay against more than 1,000 small beans); a Gaussian mixture model would handle this better. Third, about eight of the features all measure size, so size is effectively counted several times and dominates the distances, which is why the clusters follow size; feature selection or PCA (Task 3.3B) could reduce this. Finally, the result depends on the starting points (runs with a single start only agree with each other at ARI 0.84), so I used 10 restarts.</w:t>
       </w:r>
     </w:p>
     <w:p>
@@ -4969,12 +4246,22 @@
       <w:r>
         <w:rPr>
           <w:rFonts w:ascii="Arial" w:hAnsi="Arial" w:eastAsia="Arial"/>
+          <w:b w:val="0"/>
+          <w:i w:val="0"/>
+          <w:color w:val="1A1A1A"/>
+          <w:sz w:val="20"/>
+        </w:rPr>
+        <w:t xml:space="preserve">For MinPts I used the common rule of thumb of twice the number of features, 2 × 16 = 32, since a larger value gives steadier density estimates in 16 dimensions. To choose eps I sorted every bean's distance to its 32nd nearest neighbour (Figure 7a) and took the knee of the curve, where the distances suddenly shoot up. That gave </w:t>
+      </w:r>
+      <w:r>
+        <w:rPr>
+          <w:rFonts w:ascii="Arial" w:hAnsi="Arial" w:eastAsia="Arial"/>
           <w:b/>
           <w:i w:val="0"/>
           <w:color w:val="1A1A1A"/>
           <w:sz w:val="20"/>
         </w:rPr>
-        <w:t>Parameter choice.</w:t>
+        <w:t>eps = 2.48</w:t>
       </w:r>
       <w:r>
         <w:rPr>
@@ -4984,67 +4271,7 @@
           <w:color w:val="1A1A1A"/>
           <w:sz w:val="20"/>
         </w:rPr>
-        <w:t xml:space="preserve"> MinPts was set to </w:t>
-      </w:r>
-      <w:r>
-        <w:rPr>
-          <w:rFonts w:ascii="Arial" w:hAnsi="Arial" w:eastAsia="Arial"/>
-          <w:b/>
-          <w:i w:val="0"/>
-          <w:color w:val="1A1A1A"/>
-          <w:sz w:val="20"/>
-        </w:rPr>
-        <w:t>2 × dimensionality = 32</w:t>
-      </w:r>
-      <w:r>
-        <w:rPr>
-          <w:rFonts w:ascii="Arial" w:hAnsi="Arial" w:eastAsia="Arial"/>
-          <w:b w:val="0"/>
-          <w:i w:val="0"/>
-          <w:color w:val="1A1A1A"/>
-          <w:sz w:val="20"/>
-        </w:rPr>
-        <w:t xml:space="preserve"> (Sander et al., 1998; Schubert et al., 2017). In 16 dimensions a larger MinPts gives more reliable density estimates and less sensitivity to noise. eps was taken from the </w:t>
-      </w:r>
-      <w:r>
-        <w:rPr>
-          <w:rFonts w:ascii="Arial" w:hAnsi="Arial" w:eastAsia="Arial"/>
-          <w:b/>
-          <w:i w:val="0"/>
-          <w:color w:val="1A1A1A"/>
-          <w:sz w:val="20"/>
-        </w:rPr>
-        <w:t>k-distance graph</w:t>
-      </w:r>
-      <w:r>
-        <w:rPr>
-          <w:rFonts w:ascii="Arial" w:hAnsi="Arial" w:eastAsia="Arial"/>
-          <w:b w:val="0"/>
-          <w:i w:val="0"/>
-          <w:color w:val="1A1A1A"/>
-          <w:sz w:val="20"/>
-        </w:rPr>
-        <w:t xml:space="preserve">, which sorts every bean's distance to its 32nd nearest neighbour (Figure 7a). Points left of the knee lie in dense regions and the steep tail contains sparse points. The knee, found with the same chord-distance rule, gives </w:t>
-      </w:r>
-      <w:r>
-        <w:rPr>
-          <w:rFonts w:ascii="Arial" w:hAnsi="Arial" w:eastAsia="Arial"/>
-          <w:b/>
-          <w:i w:val="0"/>
-          <w:color w:val="1A1A1A"/>
-          <w:sz w:val="20"/>
-        </w:rPr>
-        <w:t>eps = 2.48</w:t>
-      </w:r>
-      <w:r>
-        <w:rPr>
-          <w:rFonts w:ascii="Arial" w:hAnsi="Arial" w:eastAsia="Arial"/>
-          <w:b w:val="0"/>
-          <w:i w:val="0"/>
-          <w:color w:val="1A1A1A"/>
-          <w:sz w:val="20"/>
-        </w:rPr>
-        <w:t xml:space="preserve"> (94.8th percentile). A sensitivity grid (Figure 7b) shows that the choice is not fragile: with MinPts = 32, every eps from 2.0 to 2.75 gives the same two-cluster solution with 1–3% noise, and neighbouring MinPts values give one or two clusters. Smaller eps (≤ 1.75) fragments the data and marks 8–53% of the beans as noise (MinPts ≥ 32), while eps = 3.0 merges almost everything into one cluster.</w:t>
+        <w:t>. Beans past the knee are in sparse areas and should count as noise. I also tried a grid of other values (Figure 7b). With MinPts = 32, every eps from 2.0 to 2.75 gave the same two clusters with 1–3% noise, so the choice is not fragile. Much smaller eps broke the data into pieces and labelled 8–53% of the beans as noise, while eps = 3.0 merged almost everything into one cluster.</w:t>
       </w:r>
     </w:p>
     <w:p>
@@ -5056,12 +4283,22 @@
       <w:r>
         <w:rPr>
           <w:rFonts w:ascii="Arial" w:hAnsi="Arial" w:eastAsia="Arial"/>
+          <w:b w:val="0"/>
+          <w:i w:val="0"/>
+          <w:color w:val="1A1A1A"/>
+          <w:sz w:val="20"/>
+        </w:rPr>
+        <w:t xml:space="preserve">DBSCAN found </w:t>
+      </w:r>
+      <w:r>
+        <w:rPr>
+          <w:rFonts w:ascii="Arial" w:hAnsi="Arial" w:eastAsia="Arial"/>
           <w:b/>
           <w:i w:val="0"/>
           <w:color w:val="1A1A1A"/>
           <w:sz w:val="20"/>
         </w:rPr>
-        <w:t>Results.</w:t>
+        <w:t>2 clusters</w:t>
       </w:r>
       <w:r>
         <w:rPr>
@@ -5071,7 +4308,7 @@
           <w:color w:val="1A1A1A"/>
           <w:sz w:val="20"/>
         </w:rPr>
-        <w:t xml:space="preserve"> DBSCAN found </w:t>
+        <w:t xml:space="preserve"> (1,901 and 72 beans) and </w:t>
       </w:r>
       <w:r>
         <w:rPr>
@@ -5081,7 +4318,7 @@
           <w:color w:val="1A1A1A"/>
           <w:sz w:val="20"/>
         </w:rPr>
-        <w:t>2 clusters</w:t>
+        <w:t>27 noise points (1.4%)</w:t>
       </w:r>
       <w:r>
         <w:rPr>
@@ -5091,27 +4328,7 @@
           <w:color w:val="1A1A1A"/>
           <w:sz w:val="20"/>
         </w:rPr>
-        <w:t xml:space="preserve"> (1,901 and 72 beans) and </w:t>
-      </w:r>
-      <w:r>
-        <w:rPr>
-          <w:rFonts w:ascii="Arial" w:hAnsi="Arial" w:eastAsia="Arial"/>
-          <w:b/>
-          <w:i w:val="0"/>
-          <w:color w:val="1A1A1A"/>
-          <w:sz w:val="20"/>
-        </w:rPr>
-        <w:t>27 noise points (1.4%)</w:t>
-      </w:r>
-      <w:r>
-        <w:rPr>
-          <w:rFonts w:ascii="Arial" w:hAnsi="Arial" w:eastAsia="Arial"/>
-          <w:b w:val="0"/>
-          <w:i w:val="0"/>
-          <w:color w:val="1A1A1A"/>
-          <w:sz w:val="20"/>
-        </w:rPr>
-        <w:t>. Cluster 1 contains only Bombay beans (72), while cluster 0 contains all six other varieties. The noise points are mainly extreme Horoz (12) and Bombay (8) beans.</w:t>
+        <w:t>. The small cluster is made up only of Bombay beans, and the big one contains all six other types. Most noise points were unusually long Horoz beans (12) and Bombay beans (8).</w:t>
       </w:r>
     </w:p>
     <w:p>
@@ -5138,7 +4355,7 @@
           <w:color w:val="404040"/>
           <w:sz w:val="17"/>
         </w:rPr>
-        <w:t>k-Means versus DBSCAN in the same standardised space (DB = Davies–Bouldin, CH = Calinski–Harabasz; internal metrics exclude DBSCAN noise; external metrics treat noise as its own group).</w:t>
+        <w:t>k-Means and DBSCAN on the same standardised data (DB = Davies–Bouldin, CH = Calinski–Harabasz; DBSCAN noise points are left out of the internal scores).</w:t>
       </w:r>
     </w:p>
     <w:tbl>
@@ -5854,13 +5071,20 @@
       <w:r>
         <w:rPr>
           <w:rFonts w:ascii="Arial" w:hAnsi="Arial" w:eastAsia="Arial"/>
-          <w:b/>
+          <w:b w:val="0"/>
           <w:i w:val="0"/>
           <w:color w:val="1A1A1A"/>
           <w:sz w:val="20"/>
         </w:rPr>
-        <w:t>Comparison and reasons for the differences.</w:t>
-      </w:r>
+        <w:t>The comparison (Table 4, Figure 7c) is interesting because the two kinds of measure disagree. DBSCAN has a better silhouette (0.554 vs 0.403) and Davies–Bouldin (0.529 vs 0.910), but it matches the real bean types far worse (ARI 0.034 vs 0.306). To check that the noise removal was not causing this, I scored k-Means on the same non-noise beans and got almost the same silhouette (0.408).</w:t>
+      </w:r>
+    </w:p>
+    <w:p>
+      <w:pPr>
+        <w:keepNext w:val="0"/>
+        <w:spacing w:after="80" w:before="0" w:line="240" w:lineRule="auto"/>
+        <w:jc w:val="both"/>
+      </w:pPr>
       <w:r>
         <w:rPr>
           <w:rFonts w:ascii="Arial" w:hAnsi="Arial" w:eastAsia="Arial"/>
@@ -5869,153 +5093,7 @@
           <w:color w:val="1A1A1A"/>
           <w:sz w:val="20"/>
         </w:rPr>
-        <w:t xml:space="preserve"> DBSCAN scores better on the separation indices (silhouette 0.554 vs 0.403; DB 0.529 vs 0.910) but far worse against the varieties (ARI 0.034 vs 0.306; NMI 0.158 vs 0.495). The silhouette advantage is not caused by removing noise, because k-Means scores 0.408 on the same non-noise beans. The algorithms differ for three reasons:</w:t>
-      </w:r>
-    </w:p>
-    <w:p>
-      <w:pPr>
-        <w:keepNext w:val="0"/>
-        <w:tabs>
-          <w:tab w:pos="255" w:val="left"/>
-        </w:tabs>
-        <w:spacing w:after="40" w:before="0" w:line="240" w:lineRule="auto"/>
-        <w:ind w:left="255" w:hanging="170"/>
-        <w:jc w:val="both"/>
-      </w:pPr>
-      <w:r>
-        <w:rPr>
-          <w:rFonts w:ascii="Arial" w:hAnsi="Arial" w:eastAsia="Arial"/>
-          <w:b w:val="0"/>
-          <w:i w:val="0"/>
-          <w:color w:val="1A1A1A"/>
-          <w:sz w:val="20"/>
-        </w:rPr>
-        <w:t>•</w:t>
-        <w:tab/>
-      </w:r>
-      <w:r>
-        <w:rPr>
-          <w:rFonts w:ascii="Arial" w:hAnsi="Arial" w:eastAsia="Arial"/>
-          <w:b/>
-          <w:i w:val="0"/>
-          <w:color w:val="1A1A1A"/>
-          <w:sz w:val="20"/>
-        </w:rPr>
-        <w:t>Different definitions of a cluster.</w:t>
-      </w:r>
-      <w:r>
-        <w:rPr>
-          <w:rFonts w:ascii="Arial" w:hAnsi="Arial" w:eastAsia="Arial"/>
-          <w:b w:val="0"/>
-          <w:i w:val="0"/>
-          <w:color w:val="1A1A1A"/>
-          <w:sz w:val="20"/>
-        </w:rPr>
-        <w:t xml:space="preserve"> k-Means divides the space into k convex cells that minimise within-cluster variance, and it cuts a continuous mass whenever that lowers the error. It therefore splits the main body of beans into small versus medium/large beans (Figure 8b). DBSCAN only separates </w:t>
-      </w:r>
-      <w:r>
-        <w:rPr>
-          <w:rFonts w:ascii="Arial" w:hAnsi="Arial" w:eastAsia="Arial"/>
-          <w:b/>
-          <w:i w:val="0"/>
-          <w:color w:val="1A1A1A"/>
-          <w:sz w:val="20"/>
-        </w:rPr>
-        <w:t>density-connected</w:t>
-      </w:r>
-      <w:r>
-        <w:rPr>
-          <w:rFonts w:ascii="Arial" w:hAnsi="Arial" w:eastAsia="Arial"/>
-          <w:b w:val="0"/>
-          <w:i w:val="0"/>
-          <w:color w:val="1A1A1A"/>
-          <w:sz w:val="20"/>
-        </w:rPr>
-        <w:t xml:space="preserve"> regions. The six non-Bombay varieties touch and overlap in one continuous dense cloud without low-density valleys (Figure 8a), so any eps large enough to connect a variety also chains it to its neighbours. Only Bombay is separated by a real empty gap.</w:t>
-      </w:r>
-    </w:p>
-    <w:p>
-      <w:pPr>
-        <w:keepNext w:val="0"/>
-        <w:tabs>
-          <w:tab w:pos="255" w:val="left"/>
-        </w:tabs>
-        <w:spacing w:after="40" w:before="0" w:line="240" w:lineRule="auto"/>
-        <w:ind w:left="255" w:hanging="170"/>
-        <w:jc w:val="both"/>
-      </w:pPr>
-      <w:r>
-        <w:rPr>
-          <w:rFonts w:ascii="Arial" w:hAnsi="Arial" w:eastAsia="Arial"/>
-          <w:b w:val="0"/>
-          <w:i w:val="0"/>
-          <w:color w:val="1A1A1A"/>
-          <w:sz w:val="20"/>
-        </w:rPr>
-        <w:t>•</w:t>
-        <w:tab/>
-      </w:r>
-      <w:r>
-        <w:rPr>
-          <w:rFonts w:ascii="Arial" w:hAnsi="Arial" w:eastAsia="Arial"/>
-          <w:b/>
-          <w:i w:val="0"/>
-          <w:color w:val="1A1A1A"/>
-          <w:sz w:val="20"/>
-        </w:rPr>
-        <w:t>What the internal metrics reward.</w:t>
-      </w:r>
-      <w:r>
-        <w:rPr>
-          <w:rFonts w:ascii="Arial" w:hAnsi="Arial" w:eastAsia="Arial"/>
-          <w:b w:val="0"/>
-          <w:i w:val="0"/>
-          <w:color w:val="1A1A1A"/>
-          <w:sz w:val="20"/>
-        </w:rPr>
-        <w:t xml:space="preserve"> The 'Bombay versus rest' split is extremely well separated, so it scores well internally even though it carries little information about the varieties. This shows that internal indices alone can be misleading.</w:t>
-      </w:r>
-    </w:p>
-    <w:p>
-      <w:pPr>
-        <w:keepNext w:val="0"/>
-        <w:tabs>
-          <w:tab w:pos="255" w:val="left"/>
-        </w:tabs>
-        <w:spacing w:after="40" w:before="0" w:line="240" w:lineRule="auto"/>
-        <w:ind w:left="255" w:hanging="170"/>
-        <w:jc w:val="both"/>
-      </w:pPr>
-      <w:r>
-        <w:rPr>
-          <w:rFonts w:ascii="Arial" w:hAnsi="Arial" w:eastAsia="Arial"/>
-          <w:b w:val="0"/>
-          <w:i w:val="0"/>
-          <w:color w:val="1A1A1A"/>
-          <w:sz w:val="20"/>
-        </w:rPr>
-        <w:t>•</w:t>
-        <w:tab/>
-      </w:r>
-      <w:r>
-        <w:rPr>
-          <w:rFonts w:ascii="Arial" w:hAnsi="Arial" w:eastAsia="Arial"/>
-          <w:b/>
-          <w:i w:val="0"/>
-          <w:color w:val="1A1A1A"/>
-          <w:sz w:val="20"/>
-        </w:rPr>
-        <w:t>Strengths and weaknesses.</w:t>
-      </w:r>
-      <w:r>
-        <w:rPr>
-          <w:rFonts w:ascii="Arial" w:hAnsi="Arial" w:eastAsia="Arial"/>
-          <w:b w:val="0"/>
-          <w:i w:val="0"/>
-          <w:color w:val="1A1A1A"/>
-          <w:sz w:val="20"/>
-        </w:rPr>
-        <w:t xml:space="preserve"> DBSCAN needs no k, flags outliers and can find arbitrary shapes. However, it uses one global density threshold (Dermason is dense while Bombay is sparse), and distance contrast shrinks in 16 dimensions, which makes eps hard to set. HDBSCAN or OPTICS, which allow varying densities, or clustering in a reduced space, are possible remedies.</w:t>
+        <w:t>I think the main reason is how each algorithm defines a cluster. k-Means simply divides the space into k regions around centres, so it is happy to cut a continuous mass of beans into 'small' and 'medium' (Figure 8b). DBSCAN only separates regions with an empty, low-density gap between them. Apart from Bombay, the six bean types form one continuous cloud (Figure 8a), so DBSCAN chains them all together. Only Bombay is separated by a real gap. The 'Bombay vs everything else' split is very clean, which is why the internal scores like it, but it says little about the bean types. This showed me that internal scores alone can be misleading. DBSCAN's advantages are that it finds the number of clusters itself and flags outliers. Its weaknesses are that it uses one density level for everything (the small beans are packed tightly, Bombay is spread out) and that eps is hard to set in 16 dimensions. A variable-density method such as HDBSCAN might do better.</w:t>
       </w:r>
     </w:p>
     <w:p>
@@ -6082,7 +5160,7 @@
           <w:color w:val="404040"/>
           <w:sz w:val="17"/>
         </w:rPr>
-        <w:t>(a) Sorted distance to the 32nd nearest neighbour with the chosen eps at the knee; (b) number of clusters and noise percentage over a grid of eps and MinPts; (c) k-Means versus DBSCAN on the same internal and external metrics.</w:t>
+        <w:t>(a) Distance to the 32nd nearest neighbour, with the chosen eps at the knee; (b) number of clusters and noise % for other eps and MinPts values; (c) k-Means and DBSCAN on the same measures.</w:t>
       </w:r>
     </w:p>
     <w:p>
@@ -6149,7 +5227,7 @@
           <w:color w:val="404040"/>
           <w:sz w:val="17"/>
         </w:rPr>
-        <w:t>Beans projected onto the first two principal components (for visualisation only): (a) true classes, (b) k-Means clusters (k = 3), (c) DBSCAN clusters (grey crosses = noise).</w:t>
+        <w:t>The beans plotted on the first two principal components (for display only): (a) real classes, (b) k-Means clusters, (c) DBSCAN clusters (grey crosses are noise).</w:t>
       </w:r>
     </w:p>
     <w:p>
@@ -6180,27 +5258,7 @@
           <w:color w:val="1A1A1A"/>
           <w:sz w:val="20"/>
         </w:rPr>
-        <w:t xml:space="preserve">PCA was applied to the </w:t>
-      </w:r>
-      <w:r>
-        <w:rPr>
-          <w:rFonts w:ascii="Arial" w:hAnsi="Arial" w:eastAsia="Arial"/>
-          <w:b/>
-          <w:i w:val="0"/>
-          <w:color w:val="1A1A1A"/>
-          <w:sz w:val="20"/>
-        </w:rPr>
-        <w:t>standardised</w:t>
-      </w:r>
-      <w:r>
-        <w:rPr>
-          <w:rFonts w:ascii="Arial" w:hAnsi="Arial" w:eastAsia="Arial"/>
-          <w:b w:val="0"/>
-          <w:i w:val="0"/>
-          <w:color w:val="1A1A1A"/>
-          <w:sz w:val="20"/>
-        </w:rPr>
-        <w:t xml:space="preserve"> inputs. On raw data the first component would simply reproduce Area, whose variance is about 10¹⁵ times larger than that of the shape factors.</w:t>
+        <w:t>I applied PCA to the standardised features; without scaling, the first component would just be Area. The first component explains 55.6% of the variance, the second 26.0%, the third 8.1%, the fourth 5.2% and the fifth 2.9%. Together the first four explain 94.9% (Figure 9a). Components 9 to 16 explain almost nothing, because many of the features are calculated from each other (for example, EquivDiameter comes straight from Area).</w:t>
       </w:r>
     </w:p>
     <w:p>
@@ -6212,12 +5270,22 @@
       <w:r>
         <w:rPr>
           <w:rFonts w:ascii="Arial" w:hAnsi="Arial" w:eastAsia="Arial"/>
+          <w:b w:val="0"/>
+          <w:i w:val="0"/>
+          <w:color w:val="1A1A1A"/>
+          <w:sz w:val="20"/>
+        </w:rPr>
+        <w:t xml:space="preserve">To decide how many components to keep, I looked at several rules. The 'eigenvalue above 1' rule and the bend in the scree plot both suggest 3, keeping at least 90% of the variance suggests 4, and 95% suggests 5. I kept </w:t>
+      </w:r>
+      <w:r>
+        <w:rPr>
+          <w:rFonts w:ascii="Arial" w:hAnsi="Arial" w:eastAsia="Arial"/>
           <w:b/>
           <w:i w:val="0"/>
           <w:color w:val="1A1A1A"/>
           <w:sz w:val="20"/>
         </w:rPr>
-        <w:t>Explained variance and the number of components.</w:t>
+        <w:t>4 components (94.9%)</w:t>
       </w:r>
       <w:r>
         <w:rPr>
@@ -6227,27 +5295,7 @@
           <w:color w:val="1A1A1A"/>
           <w:sz w:val="20"/>
         </w:rPr>
-        <w:t xml:space="preserve"> PC1 explains 55.6% of the variance (eigenvalue 8.91), PC2 26.0% (4.17), PC3 8.1% (1.29), PC4 5.2% (0.83) and PC5 2.9%, giving cumulative totals of 55.6, 81.7, 89.7, 94.9 and 97.8% (Figure 9a). Components 9–16 each explain less than 0.01%, because many variables are near-deterministic functions of others: EquivDiameter = √(4·Area/π), and AspectRation, Compactness and the shape factors are ratios of axes and area. The usual criteria give 3 components (Kaiser, eigenvalue &gt; 1, and the scree elbow), 4 (Jolliffe's relaxed cut-off of 0.7, and ≥ 90% cumulative variance) or 5 (≥ 95%). </w:t>
-      </w:r>
-      <w:r>
-        <w:rPr>
-          <w:rFonts w:ascii="Arial" w:hAnsi="Arial" w:eastAsia="Arial"/>
-          <w:b/>
-          <w:i w:val="0"/>
-          <w:color w:val="1A1A1A"/>
-          <w:sz w:val="20"/>
-        </w:rPr>
-        <w:t>Four components (94.9% of the variance)</w:t>
-      </w:r>
-      <w:r>
-        <w:rPr>
-          <w:rFonts w:ascii="Arial" w:hAnsi="Arial" w:eastAsia="Arial"/>
-          <w:b w:val="0"/>
-          <w:i w:val="0"/>
-          <w:color w:val="1A1A1A"/>
-          <w:sz w:val="20"/>
-        </w:rPr>
-        <w:t xml:space="preserve"> were retained. This satisfies the 90% rule and Jolliffe's cut-off, which is preferred because the Kaiser rule tends to keep too few components when variables are highly correlated (Jolliffe, 2002). PC4 also represents a distinct, interpretable property, while PC5 adds only 2.9%.</w:t>
+        <w:t>. The third component alone only reaches 89.7%, and the fourth captures something none of the others do (Extent), while a fifth would add less than 3%.</w:t>
       </w:r>
     </w:p>
     <w:p>
@@ -6259,168 +5307,12 @@
       <w:r>
         <w:rPr>
           <w:rFonts w:ascii="Arial" w:hAnsi="Arial" w:eastAsia="Arial"/>
-          <w:b/>
+          <w:b w:val="0"/>
           <w:i w:val="0"/>
           <w:color w:val="1A1A1A"/>
           <w:sz w:val="20"/>
         </w:rPr>
-        <w:t>Contribution of the variables</w:t>
-      </w:r>
-      <w:r>
-        <w:rPr>
-          <w:rFonts w:ascii="Arial" w:hAnsi="Arial" w:eastAsia="Arial"/>
-          <w:b w:val="0"/>
-          <w:i w:val="0"/>
-          <w:color w:val="1A1A1A"/>
-          <w:sz w:val="20"/>
-        </w:rPr>
-        <w:t xml:space="preserve"> (squared loadings, Figure 9b):</w:t>
-      </w:r>
-    </w:p>
-    <w:p>
-      <w:pPr>
-        <w:keepNext w:val="0"/>
-        <w:tabs>
-          <w:tab w:pos="255" w:val="left"/>
-        </w:tabs>
-        <w:spacing w:after="40" w:before="0" w:line="240" w:lineRule="auto"/>
-        <w:ind w:left="255" w:hanging="170"/>
-        <w:jc w:val="both"/>
-      </w:pPr>
-      <w:r>
-        <w:rPr>
-          <w:rFonts w:ascii="Arial" w:hAnsi="Arial" w:eastAsia="Arial"/>
-          <w:b w:val="0"/>
-          <w:i w:val="0"/>
-          <w:color w:val="1A1A1A"/>
-          <w:sz w:val="20"/>
-        </w:rPr>
-        <w:t>•</w:t>
-        <w:tab/>
-      </w:r>
-      <w:r>
-        <w:rPr>
-          <w:rFonts w:ascii="Arial" w:hAnsi="Arial" w:eastAsia="Arial"/>
-          <w:b/>
-          <w:i w:val="0"/>
-          <w:color w:val="1A1A1A"/>
-          <w:sz w:val="20"/>
-        </w:rPr>
-        <w:t>PC1, 'size versus roundness':</w:t>
-      </w:r>
-      <w:r>
-        <w:rPr>
-          <w:rFonts w:ascii="Arial" w:hAnsi="Arial" w:eastAsia="Arial"/>
-          <w:b w:val="0"/>
-          <w:i w:val="0"/>
-          <w:color w:val="1A1A1A"/>
-          <w:sz w:val="20"/>
-        </w:rPr>
-        <w:t xml:space="preserve"> MajorAxisLength 10.6%, ShapeFactor2 9.9% (−), Perimeter 9.7% and EquivDiameter 8.9%. It is positive for all size and elongation variables and negative for roundness, compactness and the shape factors, so it separates large, elongated beans from small, round ones.</w:t>
-      </w:r>
-    </w:p>
-    <w:p>
-      <w:pPr>
-        <w:keepNext w:val="0"/>
-        <w:tabs>
-          <w:tab w:pos="255" w:val="left"/>
-        </w:tabs>
-        <w:spacing w:after="40" w:before="0" w:line="240" w:lineRule="auto"/>
-        <w:ind w:left="255" w:hanging="170"/>
-        <w:jc w:val="both"/>
-      </w:pPr>
-      <w:r>
-        <w:rPr>
-          <w:rFonts w:ascii="Arial" w:hAnsi="Arial" w:eastAsia="Arial"/>
-          <w:b w:val="0"/>
-          <w:i w:val="0"/>
-          <w:color w:val="1A1A1A"/>
-          <w:sz w:val="20"/>
-        </w:rPr>
-        <w:t>•</w:t>
-        <w:tab/>
-      </w:r>
-      <w:r>
-        <w:rPr>
-          <w:rFonts w:ascii="Arial" w:hAnsi="Arial" w:eastAsia="Arial"/>
-          <w:b/>
-          <w:i w:val="0"/>
-          <w:color w:val="1A1A1A"/>
-          <w:sz w:val="20"/>
-        </w:rPr>
-        <w:t>PC2, 'width versus elongation' (shape independent of size):</w:t>
-      </w:r>
-      <w:r>
-        <w:rPr>
-          <w:rFonts w:ascii="Arial" w:hAnsi="Arial" w:eastAsia="Arial"/>
-          <w:b w:val="0"/>
-          <w:i w:val="0"/>
-          <w:color w:val="1A1A1A"/>
-          <w:sz w:val="20"/>
-        </w:rPr>
-        <w:t xml:space="preserve"> MinorAxisLength 11.6%, AspectRation 11.4% (−), Compactness 11.3% and ShapeFactor3 11.2%.</w:t>
-      </w:r>
-    </w:p>
-    <w:p>
-      <w:pPr>
-        <w:keepNext w:val="0"/>
-        <w:tabs>
-          <w:tab w:pos="255" w:val="left"/>
-        </w:tabs>
-        <w:spacing w:after="40" w:before="0" w:line="240" w:lineRule="auto"/>
-        <w:ind w:left="255" w:hanging="170"/>
-        <w:jc w:val="both"/>
-      </w:pPr>
-      <w:r>
-        <w:rPr>
-          <w:rFonts w:ascii="Arial" w:hAnsi="Arial" w:eastAsia="Arial"/>
-          <w:b w:val="0"/>
-          <w:i w:val="0"/>
-          <w:color w:val="1A1A1A"/>
-          <w:sz w:val="20"/>
-        </w:rPr>
-        <w:t>•</w:t>
-        <w:tab/>
-      </w:r>
-      <w:r>
-        <w:rPr>
-          <w:rFonts w:ascii="Arial" w:hAnsi="Arial" w:eastAsia="Arial"/>
-          <w:b/>
-          <w:i w:val="0"/>
-          <w:color w:val="1A1A1A"/>
-          <w:sz w:val="20"/>
-        </w:rPr>
-        <w:t>PC3, 'outline regularity':</w:t>
-      </w:r>
-      <w:r>
-        <w:rPr>
-          <w:rFonts w:ascii="Arial" w:hAnsi="Arial" w:eastAsia="Arial"/>
-          <w:b w:val="0"/>
-          <w:i w:val="0"/>
-          <w:color w:val="1A1A1A"/>
-          <w:sz w:val="20"/>
-        </w:rPr>
-        <w:t xml:space="preserve"> Solidity 54.6% and ShapeFactor4 26.1%. </w:t>
-      </w:r>
-      <w:r>
-        <w:rPr>
-          <w:rFonts w:ascii="Arial" w:hAnsi="Arial" w:eastAsia="Arial"/>
-          <w:b/>
-          <w:i w:val="0"/>
-          <w:color w:val="1A1A1A"/>
-          <w:sz w:val="20"/>
-        </w:rPr>
-        <w:t>PC4, 'bounding-box fill':</w:t>
-      </w:r>
-      <w:r>
-        <w:rPr>
-          <w:rFonts w:ascii="Arial" w:hAnsi="Arial" w:eastAsia="Arial"/>
-          <w:b w:val="0"/>
-          <w:i w:val="0"/>
-          <w:color w:val="1A1A1A"/>
-          <w:sz w:val="20"/>
-        </w:rPr>
-        <w:t xml:space="preserve"> Extent 88.1%.</w:t>
+        <w:t>The loadings (Figure 9b) make the components easy to interpret. PC1 is mainly size: all the size features load positively (MajorAxisLength contributes the most, 10.6%) and the roundness-type features negatively, so it separates big, long beans from small, round ones. PC2 is shape regardless of size: width and compactness against aspect ratio (each about 11%). PC3 is how regular the outline is (Solidity 55%, ShapeFactor4 26%), and PC4 is almost entirely Extent (88%).</w:t>
       </w:r>
     </w:p>
     <w:p>
@@ -6487,7 +5379,7 @@
           <w:color w:val="404040"/>
           <w:sz w:val="17"/>
         </w:rPr>
-        <w:t>(a) Scree plot with individual and cumulative explained variance (dotted lines at 90% and 95%); (b) loadings of the 16 standardised variables on the four retained components.</w:t>
+        <w:t>(a) Variance explained by each component and in total (dotted lines at 90% and 95%); (b) loadings of the 16 features on the four kept components.</w:t>
       </w:r>
     </w:p>
     <w:p>
@@ -6499,22 +5391,12 @@
       <w:r>
         <w:rPr>
           <w:rFonts w:ascii="Arial" w:hAnsi="Arial" w:eastAsia="Arial"/>
-          <w:b/>
+          <w:b w:val="0"/>
           <w:i w:val="0"/>
           <w:color w:val="1A1A1A"/>
           <w:sz w:val="20"/>
         </w:rPr>
-        <w:t>Clustering in the PCA space.</w:t>
-      </w:r>
-      <w:r>
-        <w:rPr>
-          <w:rFonts w:ascii="Arial" w:hAnsi="Arial" w:eastAsia="Arial"/>
-          <w:b w:val="0"/>
-          <w:i w:val="0"/>
-          <w:color w:val="1A1A1A"/>
-          <w:sz w:val="20"/>
-        </w:rPr>
-        <w:t xml:space="preserve"> k-Means was applied to the four PC scores. The internal criteria were recomputed in this space and again select k = 3 (silhouette and DB; CH gives 2), so k = 3 was kept to allow a like-for-like comparison. A whitened version, with each PC rescaled to unit variance, was added to test the effect of re-weighting the components. Table 5 compares effectiveness, stability and cluster characteristics. Stability is measured in two ways. Bootstrap stability is the mean ARI between the full-data partition and partitions learnt on 20 random 80% subsamples. Seed stability is the mean pairwise ARI of 30 single-initialisation runs.</w:t>
+        <w:t>I then ran k-Means on the 4 components. I rechecked the choice of k in this space and it still came out as 3, so I kept k = 3 to make the comparison fair. As an extra test I also tried 'whitened' components, where each component is rescaled to the same variance. Table 5 compares the three versions. Bootstrap stability is how closely the clusters from 80% subsamples match the full result, and seed stability is how much single-start runs agree with each other.</w:t>
       </w:r>
     </w:p>
     <w:p>
@@ -6541,7 +5423,7 @@
           <w:color w:val="404040"/>
           <w:sz w:val="17"/>
         </w:rPr>
-        <w:t>k-Means (k = 3) on the original features versus PCA-transformed data.</w:t>
+        <w:t>k-Means (k = 3) on the original features compared with the PCA versions.</w:t>
       </w:r>
     </w:p>
     <w:tbl>
@@ -7715,7 +6597,7 @@
           <w:color w:val="1A1A1A"/>
           <w:sz w:val="16"/>
         </w:rPr>
-        <w:t>* Agree. = ARI between the partition in that space and the partition in the original space; Boot./Seed stab. = bootstrap and seed stability (mean ARI). Silh. (orig.) is the silhouette of the same partition measured in the original standardised space.</w:t>
+        <w:t>* Agree. = how closely the clusters match the clusters from the original features (ARI). Silh. (orig.) is the silhouette of the same clusters measured on the original features.</w:t>
       </w:r>
     </w:p>
     <w:p>
@@ -7727,42 +6609,12 @@
       <w:r>
         <w:rPr>
           <w:rFonts w:ascii="Arial" w:hAnsi="Arial" w:eastAsia="Arial"/>
-          <w:b/>
+          <w:b w:val="0"/>
           <w:i w:val="0"/>
           <w:color w:val="1A1A1A"/>
           <w:sz w:val="20"/>
         </w:rPr>
-        <w:t>Impact of PCA.</w:t>
-      </w:r>
-      <w:r>
-        <w:rPr>
-          <w:rFonts w:ascii="Arial" w:hAnsi="Arial" w:eastAsia="Arial"/>
-          <w:b w:val="0"/>
-          <w:i w:val="0"/>
-          <w:color w:val="1A1A1A"/>
-          <w:sz w:val="20"/>
-        </w:rPr>
-        <w:t xml:space="preserve"> With four PCs, k-Means produces practically </w:t>
-      </w:r>
-      <w:r>
-        <w:rPr>
-          <w:rFonts w:ascii="Arial" w:hAnsi="Arial" w:eastAsia="Arial"/>
-          <w:b/>
-          <w:i w:val="0"/>
-          <w:color w:val="1A1A1A"/>
-          <w:sz w:val="20"/>
-        </w:rPr>
-        <w:t>the same clustering</w:t>
-      </w:r>
-      <w:r>
-        <w:rPr>
-          <w:rFonts w:ascii="Arial" w:hAnsi="Arial" w:eastAsia="Arial"/>
-          <w:b w:val="0"/>
-          <w:i w:val="0"/>
-          <w:color w:val="1A1A1A"/>
-          <w:sz w:val="20"/>
-        </w:rPr>
-        <w:t xml:space="preserve"> as in the original space: the agreement ARI is 0.990, only 5 of 2,000 beans change cluster, and the cluster sizes and Bombay/small/medium profiles are the same. Effectiveness is unchanged (ARI 0.304 vs 0.306; NMI 0.492 vs 0.495) and so is stability (bootstrap 0.995 vs 0.997; seed stability 0.81 vs 0.84, a difference within its run-to-run variability, Figure 10c). Fitting was about 2.5× faster (36 vs 91 ms). The only metrics that 'improve' are the internal ones computed in the reduced space (silhouette 0.421 vs 0.403; DB 0.862 vs 0.910). Figure 10a shows that this is an artefact. Silhouette in the own space grows steadily as components are dropped (0.65 with one PC), but when the same partitions are evaluated in the original space their silhouette stays at 0.40. Discarding low-variance directions shrinks the within-cluster distances; it does not make the clusters better separated.</w:t>
+        <w:t>With 4 components, k-Means found practically the same clusters as before: only 5 of the 2,000 beans changed cluster (agreement 0.990). The match with the real types (ARI 0.304 vs 0.306) and the stability (0.995 vs 0.997) barely changed, and the cluster sizes and their size-based meaning stayed the same. It did run about 2.5 times faster. At first the silhouette looked better in the PCA space (0.421 vs 0.403), but Figure 10a shows this is misleading. The fewer components I kept, the higher the silhouette in the reduced space (0.65 with one component), yet the same clusters measured on the original features stay at 0.40. Dropping dimensions makes the clusters look tighter without actually changing them.</w:t>
       </w:r>
     </w:p>
     <w:p>
@@ -7774,222 +6626,12 @@
       <w:r>
         <w:rPr>
           <w:rFonts w:ascii="Arial" w:hAnsi="Arial" w:eastAsia="Arial"/>
-          <w:b/>
+          <w:b w:val="0"/>
           <w:i w:val="0"/>
           <w:color w:val="1A1A1A"/>
           <w:sz w:val="20"/>
         </w:rPr>
-        <w:t>Critical discussion: why PCA neither improves nor clearly deteriorates the clustering here.</w:t>
-      </w:r>
-    </w:p>
-    <w:p>
-      <w:pPr>
-        <w:keepNext w:val="0"/>
-        <w:tabs>
-          <w:tab w:pos="255" w:val="left"/>
-        </w:tabs>
-        <w:spacing w:after="40" w:before="0" w:line="240" w:lineRule="auto"/>
-        <w:ind w:left="255" w:hanging="170"/>
-        <w:jc w:val="both"/>
-      </w:pPr>
-      <w:r>
-        <w:rPr>
-          <w:rFonts w:ascii="Arial" w:hAnsi="Arial" w:eastAsia="Arial"/>
-          <w:b w:val="0"/>
-          <w:i w:val="0"/>
-          <w:color w:val="1A1A1A"/>
-          <w:sz w:val="20"/>
-        </w:rPr>
-        <w:t>•</w:t>
-        <w:tab/>
-      </w:r>
-      <w:r>
-        <w:rPr>
-          <w:rFonts w:ascii="Arial" w:hAnsi="Arial" w:eastAsia="Arial"/>
-          <w:b/>
-          <w:i w:val="0"/>
-          <w:color w:val="1A1A1A"/>
-          <w:sz w:val="20"/>
-        </w:rPr>
-        <w:t>Characteristics of k-Means.</w:t>
-      </w:r>
-      <w:r>
-        <w:rPr>
-          <w:rFonts w:ascii="Arial" w:hAnsi="Arial" w:eastAsia="Arial"/>
-          <w:b w:val="0"/>
-          <w:i w:val="0"/>
-          <w:color w:val="1A1A1A"/>
-          <w:sz w:val="20"/>
-        </w:rPr>
-        <w:t xml:space="preserve"> k-Means uses Euclidean distance, which is unchanged by the orthogonal rotation PCA performs. Keeping six or more PCs reproduces the original partition exactly (agreement ARI = 1.000), so truncation can only remove information, here 5.1% of the variance. The size-driven cluster structure lies in PC1–PC2, and the leading principal components span the continuous solution of the k-means problem (Ding &amp; He, 2004), so truncating to four PCs preserves the structure.</w:t>
-      </w:r>
-    </w:p>
-    <w:p>
-      <w:pPr>
-        <w:keepNext w:val="0"/>
-        <w:tabs>
-          <w:tab w:pos="255" w:val="left"/>
-        </w:tabs>
-        <w:spacing w:after="40" w:before="0" w:line="240" w:lineRule="auto"/>
-        <w:ind w:left="255" w:hanging="170"/>
-        <w:jc w:val="both"/>
-      </w:pPr>
-      <w:r>
-        <w:rPr>
-          <w:rFonts w:ascii="Arial" w:hAnsi="Arial" w:eastAsia="Arial"/>
-          <w:b w:val="0"/>
-          <w:i w:val="0"/>
-          <w:color w:val="1A1A1A"/>
-          <w:sz w:val="20"/>
-        </w:rPr>
-        <w:t>•</w:t>
-        <w:tab/>
-      </w:r>
-      <w:r>
-        <w:rPr>
-          <w:rFonts w:ascii="Arial" w:hAnsi="Arial" w:eastAsia="Arial"/>
-          <w:b/>
-          <w:i w:val="0"/>
-          <w:color w:val="1A1A1A"/>
-          <w:sz w:val="20"/>
-        </w:rPr>
-        <w:t>Feature correlation.</w:t>
-      </w:r>
-      <w:r>
-        <w:rPr>
-          <w:rFonts w:ascii="Arial" w:hAnsi="Arial" w:eastAsia="Arial"/>
-          <w:b w:val="0"/>
-          <w:i w:val="0"/>
-          <w:color w:val="1A1A1A"/>
-          <w:sz w:val="20"/>
-        </w:rPr>
-        <w:t xml:space="preserve"> PCA removes the redundancy (16 correlated variables become 4 uncorrelated ones) but does not re-weight it. The redundant size variables re-appear as the dominant PC1 (56% of the variance), so k-Means in PCA space is still size-dominated and finds the same groups.</w:t>
-      </w:r>
-    </w:p>
-    <w:p>
-      <w:pPr>
-        <w:keepNext w:val="0"/>
-        <w:tabs>
-          <w:tab w:pos="255" w:val="left"/>
-        </w:tabs>
-        <w:spacing w:after="40" w:before="0" w:line="240" w:lineRule="auto"/>
-        <w:ind w:left="255" w:hanging="170"/>
-        <w:jc w:val="both"/>
-      </w:pPr>
-      <w:r>
-        <w:rPr>
-          <w:rFonts w:ascii="Arial" w:hAnsi="Arial" w:eastAsia="Arial"/>
-          <w:b w:val="0"/>
-          <w:i w:val="0"/>
-          <w:color w:val="1A1A1A"/>
-          <w:sz w:val="20"/>
-        </w:rPr>
-        <w:t>•</w:t>
-        <w:tab/>
-      </w:r>
-      <w:r>
-        <w:rPr>
-          <w:rFonts w:ascii="Arial" w:hAnsi="Arial" w:eastAsia="Arial"/>
-          <w:b/>
-          <w:i w:val="0"/>
-          <w:color w:val="1A1A1A"/>
-          <w:sz w:val="20"/>
-        </w:rPr>
-        <w:t>Trade-off between dimensionality reduction and information.</w:t>
-      </w:r>
-      <w:r>
-        <w:rPr>
-          <w:rFonts w:ascii="Arial" w:hAnsi="Arial" w:eastAsia="Arial"/>
-          <w:b w:val="0"/>
-          <w:i w:val="0"/>
-          <w:color w:val="1A1A1A"/>
-          <w:sz w:val="20"/>
-        </w:rPr>
-        <w:t xml:space="preserve"> Four PCs keep 94.9% of the information with 4× fewer dimensions and give the same clustering quality. The benefit is efficiency, a compact representation and 2-D visualisation (Figure 8), not effectiveness. Reducing further to one PC starts to lose structure (agreement 0.937, bootstrap stability 0.968).</w:t>
-      </w:r>
-    </w:p>
-    <w:p>
-      <w:pPr>
-        <w:keepNext w:val="0"/>
-        <w:tabs>
-          <w:tab w:pos="255" w:val="left"/>
-        </w:tabs>
-        <w:spacing w:after="40" w:before="0" w:line="240" w:lineRule="auto"/>
-        <w:ind w:left="255" w:hanging="170"/>
-        <w:jc w:val="both"/>
-      </w:pPr>
-      <w:r>
-        <w:rPr>
-          <w:rFonts w:ascii="Arial" w:hAnsi="Arial" w:eastAsia="Arial"/>
-          <w:b w:val="0"/>
-          <w:i w:val="0"/>
-          <w:color w:val="1A1A1A"/>
-          <w:sz w:val="20"/>
-        </w:rPr>
-        <w:t>•</w:t>
-        <w:tab/>
-      </w:r>
-      <w:r>
-        <w:rPr>
-          <w:rFonts w:ascii="Arial" w:hAnsi="Arial" w:eastAsia="Arial"/>
-          <w:b/>
-          <w:i w:val="0"/>
-          <w:color w:val="1A1A1A"/>
-          <w:sz w:val="20"/>
-        </w:rPr>
-        <w:t>Re-weighting the components hurts.</w:t>
-      </w:r>
-      <w:r>
-        <w:rPr>
-          <w:rFonts w:ascii="Arial" w:hAnsi="Arial" w:eastAsia="Arial"/>
-          <w:b w:val="0"/>
-          <w:i w:val="0"/>
-          <w:color w:val="1A1A1A"/>
-          <w:sz w:val="20"/>
-        </w:rPr>
-        <w:t xml:space="preserve"> Whitening gives the low-variance components (Solidity, Extent), which mostly hold within-variety noise, the same weight as the size axis. The partition changes completely (agreement 0.53), ARI falls to 0.24 and the solution becomes unstable (seed stability 0.36). On this dataset the high-variance directions carry the discriminative structure.</w:t>
-      </w:r>
-    </w:p>
-    <w:p>
-      <w:pPr>
-        <w:keepNext w:val="0"/>
-        <w:tabs>
-          <w:tab w:pos="255" w:val="left"/>
-        </w:tabs>
-        <w:spacing w:after="40" w:before="0" w:line="240" w:lineRule="auto"/>
-        <w:ind w:left="255" w:hanging="170"/>
-        <w:jc w:val="both"/>
-      </w:pPr>
-      <w:r>
-        <w:rPr>
-          <w:rFonts w:ascii="Arial" w:hAnsi="Arial" w:eastAsia="Arial"/>
-          <w:b w:val="0"/>
-          <w:i w:val="0"/>
-          <w:color w:val="1A1A1A"/>
-          <w:sz w:val="20"/>
-        </w:rPr>
-        <w:t>•</w:t>
-        <w:tab/>
-      </w:r>
-      <w:r>
-        <w:rPr>
-          <w:rFonts w:ascii="Arial" w:hAnsi="Arial" w:eastAsia="Arial"/>
-          <w:b/>
-          <w:i w:val="0"/>
-          <w:color w:val="1A1A1A"/>
-          <w:sz w:val="20"/>
-        </w:rPr>
-        <w:t>The other algorithm.</w:t>
-      </w:r>
-      <w:r>
-        <w:rPr>
-          <w:rFonts w:ascii="Arial" w:hAnsi="Arial" w:eastAsia="Arial"/>
-          <w:b w:val="0"/>
-          <w:i w:val="0"/>
-          <w:color w:val="1A1A1A"/>
-          <w:sz w:val="20"/>
-        </w:rPr>
-        <w:t xml:space="preserve"> Density-based clustering might be expected to benefit more, because distances are less concentrated in four dimensions. However, DBSCAN on the four PCs (MinPts = 8, knee eps = 1.44) again found only Bombay versus the rest (ARI 0.036). The overlap between varieties is real and is not caused by high dimensionality.</w:t>
+        <w:t>I think there are a few reasons why PCA neither helped nor hurt here. k-Means works on distances, and PCA is basically a rotation, which does not change distances. Keeping six or more components gave exactly the same clusters, and dropping down to four only removed 5% of the variance. The size structure that k-Means finds lives in the first two components, which are always kept. PCA also removes the correlation between features, but it does not reduce the weight of size: the many correlated size features simply become PC1, which still carries 56% of the variance, so the clusters still follow size. The whitened version shows the other side of this. Giving every component equal weight boosted outline regularity and Extent, which carry mostly noise here. The clusters changed completely (agreement 0.53), the match with the real types dropped (ARI 0.24) and the results became unstable. So in this data the high-variance directions are where the useful structure is. Reducing too far does lose information: with only one component the clusters started to drift (agreement 0.94). I also tried DBSCAN on the 4 components, and it again only separated Bombay from the rest, which suggests the overlap between bean types is real and not just an effect of having many dimensions.</w:t>
       </w:r>
     </w:p>
     <w:p>
@@ -8001,22 +6643,12 @@
       <w:r>
         <w:rPr>
           <w:rFonts w:ascii="Arial" w:hAnsi="Arial" w:eastAsia="Arial"/>
-          <w:b/>
+          <w:b w:val="0"/>
           <w:i w:val="0"/>
           <w:color w:val="1A1A1A"/>
           <w:sz w:val="20"/>
         </w:rPr>
-        <w:t>Conclusion.</w:t>
-      </w:r>
-      <w:r>
-        <w:rPr>
-          <w:rFonts w:ascii="Arial" w:hAnsi="Arial" w:eastAsia="Arial"/>
-          <w:b w:val="0"/>
-          <w:i w:val="0"/>
-          <w:color w:val="1A1A1A"/>
-          <w:sz w:val="20"/>
-        </w:rPr>
-        <w:t xml:space="preserve"> PCA compressed the 16 strongly correlated inputs into four interpretable components (size, shape, outline regularity, extent) with 95% of the information. Clustering on them is as effective, stable and similar in character as clustering on the original features, and it is cheaper. It is not more accurate, because k-Means already used this dominant variance structure. Getting clusters closer to the seven varieties would need a different distance weighting or cluster model (e.g. emphasising the shape components, or Gaussian mixtures), not dimensionality reduction alone.</w:t>
+        <w:t>Overall, PCA gave a smaller, easier-to-explain version of the data with the same clustering quality and a faster run time, but not better clusters. Getting closer to the seven bean types would need a different way of weighting the features or a different cluster model, not just fewer dimensions.</w:t>
       </w:r>
     </w:p>
     <w:p>
@@ -8083,7 +6715,7 @@
           <w:color w:val="404040"/>
           <w:sz w:val="17"/>
         </w:rPr>
-        <w:t>k-Means (k = 3) as a function of the number of retained PCs: (a) silhouette in the reduced versus the original space, (b) agreement with the true classes, (c) stability; (d) comparison of the original, PCA and whitened-PCA representations.</w:t>
+        <w:t>k-Means (k = 3) as the number of kept components changes: (a) silhouette in the reduced and original space, (b) match with the real classes, (c) stability; (d) the three versions side by side.</w:t>
       </w:r>
     </w:p>
     <w:p>
@@ -8114,7 +6746,7 @@
           <w:color w:val="1A1A1A"/>
           <w:sz w:val="20"/>
         </w:rPr>
-        <w:t>Claude (Anthropic, 2026), a generative AI tool, was used to help structure the analysis code, check the implementation and draft the wording of this report. All code was executed and all results, figures and statements were checked against the notebook outputs. The author takes responsibility for the content.</w:t>
+        <w:t>I used Claude (Anthropic, 2026) to help plan the analysis, write and check parts of the Python code, and improve the wording of this report. I ran all the code myself, and every number and figure in this report comes from my notebook outputs.</w:t>
       </w:r>
     </w:p>
     <w:p>
@@ -8184,7 +6816,7 @@
           <w:color w:val="1A1A1A"/>
           <w:sz w:val="18"/>
         </w:rPr>
-        <w:t xml:space="preserve">Ding, C., &amp; He, X. (2004). K-means clustering via principal component analysis. In </w:t>
+        <w:t xml:space="preserve">Gou, J., Zhan, Y., Rao, Y., Shen, X., Wang, X., &amp; He, W. (2014). Improved pseudo nearest neighbor classification. </w:t>
       </w:r>
       <w:r>
         <w:rPr>
@@ -8194,7 +6826,7 @@
           <w:color w:val="1A1A1A"/>
           <w:sz w:val="18"/>
         </w:rPr>
-        <w:t>Proceedings of the Twenty-First International Conference on Machine Learning</w:t>
+        <w:t>Knowledge-Based Systems, 70</w:t>
       </w:r>
       <w:r>
         <w:rPr>
@@ -8204,7 +6836,7 @@
           <w:color w:val="1A1A1A"/>
           <w:sz w:val="18"/>
         </w:rPr>
-        <w:t xml:space="preserve"> (p. 29). ACM. https://doi.org/10.1145/1015330.1015408</w:t>
+        <w:t>, 361–375. https://doi.org/10.1016/j.knosys.2014.07.020</w:t>
       </w:r>
     </w:p>
     <w:p>
@@ -8222,7 +6854,7 @@
           <w:color w:val="1A1A1A"/>
           <w:sz w:val="18"/>
         </w:rPr>
-        <w:t xml:space="preserve">Gou, J., Zhan, Y., Rao, Y., Shen, X., Wang, X., &amp; He, W. (2014). Improved pseudo nearest neighbor classification. </w:t>
+        <w:t xml:space="preserve">Mitani, Y., &amp; Hamamoto, Y. (2006). A local mean-based nonparametric classifier. </w:t>
       </w:r>
       <w:r>
         <w:rPr>
@@ -8232,7 +6864,7 @@
           <w:color w:val="1A1A1A"/>
           <w:sz w:val="18"/>
         </w:rPr>
-        <w:t>Knowledge-Based Systems, 70</w:t>
+        <w:t>Pattern Recognition Letters, 27</w:t>
       </w:r>
       <w:r>
         <w:rPr>
@@ -8242,349 +6874,7 @@
           <w:color w:val="1A1A1A"/>
           <w:sz w:val="18"/>
         </w:rPr>
-        <w:t>, 361–375. https://doi.org/10.1016/j.knosys.2014.07.020</w:t>
-      </w:r>
-    </w:p>
-    <w:p>
-      <w:pPr>
-        <w:keepNext w:val="0"/>
-        <w:spacing w:after="60" w:before="0" w:line="240" w:lineRule="auto"/>
-        <w:ind w:left="567" w:hanging="567"/>
-        <w:jc w:val="left"/>
-      </w:pPr>
-      <w:r>
-        <w:rPr>
-          <w:rFonts w:ascii="Arial" w:hAnsi="Arial" w:eastAsia="Arial"/>
-          <w:b w:val="0"/>
-          <w:i w:val="0"/>
-          <w:color w:val="1A1A1A"/>
-          <w:sz w:val="18"/>
-        </w:rPr>
-        <w:t xml:space="preserve">Hubert, L., &amp; Arabie, P. (1985). Comparing partitions. </w:t>
-      </w:r>
-      <w:r>
-        <w:rPr>
-          <w:rFonts w:ascii="Arial" w:hAnsi="Arial" w:eastAsia="Arial"/>
-          <w:b w:val="0"/>
-          <w:i/>
-          <w:color w:val="1A1A1A"/>
-          <w:sz w:val="18"/>
-        </w:rPr>
-        <w:t>Journal of Classification, 2</w:t>
-      </w:r>
-      <w:r>
-        <w:rPr>
-          <w:rFonts w:ascii="Arial" w:hAnsi="Arial" w:eastAsia="Arial"/>
-          <w:b w:val="0"/>
-          <w:i w:val="0"/>
-          <w:color w:val="1A1A1A"/>
-          <w:sz w:val="18"/>
-        </w:rPr>
-        <w:t>(1), 193–218. https://doi.org/10.1007/BF01908075</w:t>
-      </w:r>
-    </w:p>
-    <w:p>
-      <w:pPr>
-        <w:keepNext w:val="0"/>
-        <w:spacing w:after="60" w:before="0" w:line="240" w:lineRule="auto"/>
-        <w:ind w:left="567" w:hanging="567"/>
-        <w:jc w:val="left"/>
-      </w:pPr>
-      <w:r>
-        <w:rPr>
-          <w:rFonts w:ascii="Arial" w:hAnsi="Arial" w:eastAsia="Arial"/>
-          <w:b w:val="0"/>
-          <w:i w:val="0"/>
-          <w:color w:val="1A1A1A"/>
-          <w:sz w:val="18"/>
-        </w:rPr>
-        <w:t xml:space="preserve">Jolliffe, I. T. (2002). </w:t>
-      </w:r>
-      <w:r>
-        <w:rPr>
-          <w:rFonts w:ascii="Arial" w:hAnsi="Arial" w:eastAsia="Arial"/>
-          <w:b w:val="0"/>
-          <w:i/>
-          <w:color w:val="1A1A1A"/>
-          <w:sz w:val="18"/>
-        </w:rPr>
-        <w:t>Principal component analysis</w:t>
-      </w:r>
-      <w:r>
-        <w:rPr>
-          <w:rFonts w:ascii="Arial" w:hAnsi="Arial" w:eastAsia="Arial"/>
-          <w:b w:val="0"/>
-          <w:i w:val="0"/>
-          <w:color w:val="1A1A1A"/>
-          <w:sz w:val="18"/>
-        </w:rPr>
-        <w:t xml:space="preserve"> (2nd ed.). Springer. https://doi.org/10.1007/b98835</w:t>
-      </w:r>
-    </w:p>
-    <w:p>
-      <w:pPr>
-        <w:keepNext w:val="0"/>
-        <w:spacing w:after="60" w:before="0" w:line="240" w:lineRule="auto"/>
-        <w:ind w:left="567" w:hanging="567"/>
-        <w:jc w:val="left"/>
-      </w:pPr>
-      <w:r>
-        <w:rPr>
-          <w:rFonts w:ascii="Arial" w:hAnsi="Arial" w:eastAsia="Arial"/>
-          <w:b w:val="0"/>
-          <w:i w:val="0"/>
-          <w:color w:val="1A1A1A"/>
-          <w:sz w:val="18"/>
-        </w:rPr>
-        <w:t xml:space="preserve">Koklu, M., &amp; Ozkan, I. A. (2020). Multiclass classification of dry beans using computer vision and machine learning techniques. </w:t>
-      </w:r>
-      <w:r>
-        <w:rPr>
-          <w:rFonts w:ascii="Arial" w:hAnsi="Arial" w:eastAsia="Arial"/>
-          <w:b w:val="0"/>
-          <w:i/>
-          <w:color w:val="1A1A1A"/>
-          <w:sz w:val="18"/>
-        </w:rPr>
-        <w:t>Computers and Electronics in Agriculture, 174</w:t>
-      </w:r>
-      <w:r>
-        <w:rPr>
-          <w:rFonts w:ascii="Arial" w:hAnsi="Arial" w:eastAsia="Arial"/>
-          <w:b w:val="0"/>
-          <w:i w:val="0"/>
-          <w:color w:val="1A1A1A"/>
-          <w:sz w:val="18"/>
-        </w:rPr>
-        <w:t>, Article 105507. https://doi.org/10.1016/j.compag.2020.105507</w:t>
-      </w:r>
-    </w:p>
-    <w:p>
-      <w:pPr>
-        <w:keepNext w:val="0"/>
-        <w:spacing w:after="60" w:before="0" w:line="240" w:lineRule="auto"/>
-        <w:ind w:left="567" w:hanging="567"/>
-        <w:jc w:val="left"/>
-      </w:pPr>
-      <w:r>
-        <w:rPr>
-          <w:rFonts w:ascii="Arial" w:hAnsi="Arial" w:eastAsia="Arial"/>
-          <w:b w:val="0"/>
-          <w:i w:val="0"/>
-          <w:color w:val="1A1A1A"/>
-          <w:sz w:val="18"/>
-        </w:rPr>
-        <w:t xml:space="preserve">Mitani, Y., &amp; Hamamoto, Y. (2006). A local mean-based nonparametric classifier. </w:t>
-      </w:r>
-      <w:r>
-        <w:rPr>
-          <w:rFonts w:ascii="Arial" w:hAnsi="Arial" w:eastAsia="Arial"/>
-          <w:b w:val="0"/>
-          <w:i/>
-          <w:color w:val="1A1A1A"/>
-          <w:sz w:val="18"/>
-        </w:rPr>
-        <w:t>Pattern Recognition Letters, 27</w:t>
-      </w:r>
-      <w:r>
-        <w:rPr>
-          <w:rFonts w:ascii="Arial" w:hAnsi="Arial" w:eastAsia="Arial"/>
-          <w:b w:val="0"/>
-          <w:i w:val="0"/>
-          <w:color w:val="1A1A1A"/>
-          <w:sz w:val="18"/>
-        </w:rPr>
         <w:t>(10), 1151–1159. https://doi.org/10.1016/j.patrec.2005.12.016</w:t>
-      </w:r>
-    </w:p>
-    <w:p>
-      <w:pPr>
-        <w:keepNext w:val="0"/>
-        <w:spacing w:after="60" w:before="0" w:line="240" w:lineRule="auto"/>
-        <w:ind w:left="567" w:hanging="567"/>
-        <w:jc w:val="left"/>
-      </w:pPr>
-      <w:r>
-        <w:rPr>
-          <w:rFonts w:ascii="Arial" w:hAnsi="Arial" w:eastAsia="Arial"/>
-          <w:b w:val="0"/>
-          <w:i w:val="0"/>
-          <w:color w:val="1A1A1A"/>
-          <w:sz w:val="18"/>
-        </w:rPr>
-        <w:t xml:space="preserve">Pedregosa, F., Varoquaux, G., Gramfort, A., Michel, V., Thirion, B., Grisel, O., Blondel, M., Prettenhofer, P., Weiss, R., Dubourg, V., Vanderplas, J., Passos, A., Cournapeau, D., Brucher, M., Perrot, M., &amp; Duchesnay, É. (2011). Scikit-learn: Machine learning in Python. </w:t>
-      </w:r>
-      <w:r>
-        <w:rPr>
-          <w:rFonts w:ascii="Arial" w:hAnsi="Arial" w:eastAsia="Arial"/>
-          <w:b w:val="0"/>
-          <w:i/>
-          <w:color w:val="1A1A1A"/>
-          <w:sz w:val="18"/>
-        </w:rPr>
-        <w:t>Journal of Machine Learning Research, 12</w:t>
-      </w:r>
-      <w:r>
-        <w:rPr>
-          <w:rFonts w:ascii="Arial" w:hAnsi="Arial" w:eastAsia="Arial"/>
-          <w:b w:val="0"/>
-          <w:i w:val="0"/>
-          <w:color w:val="1A1A1A"/>
-          <w:sz w:val="18"/>
-        </w:rPr>
-        <w:t>, 2825–2830.</w:t>
-      </w:r>
-    </w:p>
-    <w:p>
-      <w:pPr>
-        <w:keepNext w:val="0"/>
-        <w:spacing w:after="60" w:before="0" w:line="240" w:lineRule="auto"/>
-        <w:ind w:left="567" w:hanging="567"/>
-        <w:jc w:val="left"/>
-      </w:pPr>
-      <w:r>
-        <w:rPr>
-          <w:rFonts w:ascii="Arial" w:hAnsi="Arial" w:eastAsia="Arial"/>
-          <w:b w:val="0"/>
-          <w:i w:val="0"/>
-          <w:color w:val="1A1A1A"/>
-          <w:sz w:val="18"/>
-        </w:rPr>
-        <w:t xml:space="preserve">Rousseeuw, P. J. (1987). Silhouettes: A graphical aid to the interpretation and validation of cluster analysis. </w:t>
-      </w:r>
-      <w:r>
-        <w:rPr>
-          <w:rFonts w:ascii="Arial" w:hAnsi="Arial" w:eastAsia="Arial"/>
-          <w:b w:val="0"/>
-          <w:i/>
-          <w:color w:val="1A1A1A"/>
-          <w:sz w:val="18"/>
-        </w:rPr>
-        <w:t>Journal of Computational and Applied Mathematics, 20</w:t>
-      </w:r>
-      <w:r>
-        <w:rPr>
-          <w:rFonts w:ascii="Arial" w:hAnsi="Arial" w:eastAsia="Arial"/>
-          <w:b w:val="0"/>
-          <w:i w:val="0"/>
-          <w:color w:val="1A1A1A"/>
-          <w:sz w:val="18"/>
-        </w:rPr>
-        <w:t>, 53–65. https://doi.org/10.1016/0377-0427(87)90125-7</w:t>
-      </w:r>
-    </w:p>
-    <w:p>
-      <w:pPr>
-        <w:keepNext w:val="0"/>
-        <w:spacing w:after="60" w:before="0" w:line="240" w:lineRule="auto"/>
-        <w:ind w:left="567" w:hanging="567"/>
-        <w:jc w:val="left"/>
-      </w:pPr>
-      <w:r>
-        <w:rPr>
-          <w:rFonts w:ascii="Arial" w:hAnsi="Arial" w:eastAsia="Arial"/>
-          <w:b w:val="0"/>
-          <w:i w:val="0"/>
-          <w:color w:val="1A1A1A"/>
-          <w:sz w:val="18"/>
-        </w:rPr>
-        <w:t xml:space="preserve">Sander, J., Ester, M., Kriegel, H.-P., &amp; Xu, X. (1998). Density-based clustering in spatial databases: The algorithm GDBSCAN and its applications. </w:t>
-      </w:r>
-      <w:r>
-        <w:rPr>
-          <w:rFonts w:ascii="Arial" w:hAnsi="Arial" w:eastAsia="Arial"/>
-          <w:b w:val="0"/>
-          <w:i/>
-          <w:color w:val="1A1A1A"/>
-          <w:sz w:val="18"/>
-        </w:rPr>
-        <w:t>Data Mining and Knowledge Discovery, 2</w:t>
-      </w:r>
-      <w:r>
-        <w:rPr>
-          <w:rFonts w:ascii="Arial" w:hAnsi="Arial" w:eastAsia="Arial"/>
-          <w:b w:val="0"/>
-          <w:i w:val="0"/>
-          <w:color w:val="1A1A1A"/>
-          <w:sz w:val="18"/>
-        </w:rPr>
-        <w:t>(2), 169–194. https://doi.org/10.1023/A:1009745219419</w:t>
-      </w:r>
-    </w:p>
-    <w:p>
-      <w:pPr>
-        <w:keepNext w:val="0"/>
-        <w:spacing w:after="60" w:before="0" w:line="240" w:lineRule="auto"/>
-        <w:ind w:left="567" w:hanging="567"/>
-        <w:jc w:val="left"/>
-      </w:pPr>
-      <w:r>
-        <w:rPr>
-          <w:rFonts w:ascii="Arial" w:hAnsi="Arial" w:eastAsia="Arial"/>
-          <w:b w:val="0"/>
-          <w:i w:val="0"/>
-          <w:color w:val="1A1A1A"/>
-          <w:sz w:val="18"/>
-        </w:rPr>
-        <w:t xml:space="preserve">Satopää, V., Albrecht, J., Irwin, D., &amp; Raghavan, B. (2011). Finding a "kneedle" in a haystack: Detecting knee points in system behavior. In </w:t>
-      </w:r>
-      <w:r>
-        <w:rPr>
-          <w:rFonts w:ascii="Arial" w:hAnsi="Arial" w:eastAsia="Arial"/>
-          <w:b w:val="0"/>
-          <w:i/>
-          <w:color w:val="1A1A1A"/>
-          <w:sz w:val="18"/>
-        </w:rPr>
-        <w:t>2011 31st International Conference on Distributed Computing Systems Workshops</w:t>
-      </w:r>
-      <w:r>
-        <w:rPr>
-          <w:rFonts w:ascii="Arial" w:hAnsi="Arial" w:eastAsia="Arial"/>
-          <w:b w:val="0"/>
-          <w:i w:val="0"/>
-          <w:color w:val="1A1A1A"/>
-          <w:sz w:val="18"/>
-        </w:rPr>
-        <w:t xml:space="preserve"> (pp. 166–171). IEEE. https://doi.org/10.1109/ICDCSW.2011.20</w:t>
-      </w:r>
-    </w:p>
-    <w:p>
-      <w:pPr>
-        <w:keepNext w:val="0"/>
-        <w:spacing w:after="60" w:before="0" w:line="240" w:lineRule="auto"/>
-        <w:ind w:left="567" w:hanging="567"/>
-        <w:jc w:val="left"/>
-      </w:pPr>
-      <w:r>
-        <w:rPr>
-          <w:rFonts w:ascii="Arial" w:hAnsi="Arial" w:eastAsia="Arial"/>
-          <w:b w:val="0"/>
-          <w:i w:val="0"/>
-          <w:color w:val="1A1A1A"/>
-          <w:sz w:val="18"/>
-        </w:rPr>
-        <w:t xml:space="preserve">Schubert, E., Sander, J., Ester, M., Kriegel, H.-P., &amp; Xu, X. (2017). DBSCAN revisited, revisited: Why and how you should (still) use DBSCAN. </w:t>
-      </w:r>
-      <w:r>
-        <w:rPr>
-          <w:rFonts w:ascii="Arial" w:hAnsi="Arial" w:eastAsia="Arial"/>
-          <w:b w:val="0"/>
-          <w:i/>
-          <w:color w:val="1A1A1A"/>
-          <w:sz w:val="18"/>
-        </w:rPr>
-        <w:t>ACM Transactions on Database Systems, 42</w:t>
-      </w:r>
-      <w:r>
-        <w:rPr>
-          <w:rFonts w:ascii="Arial" w:hAnsi="Arial" w:eastAsia="Arial"/>
-          <w:b w:val="0"/>
-          <w:i w:val="0"/>
-          <w:color w:val="1A1A1A"/>
-          <w:sz w:val="18"/>
-        </w:rPr>
-        <w:t>(3), Article 19. https://doi.org/10.1145/3068335</w:t>
       </w:r>
     </w:p>
     <w:sectPr>

</xml_diff>